<commit_message>
feat: align contest materials with official grade 4 sample texts and audio
- 04 Mandarin Reading: 100% align with official text <Blue Butterfly> by Lin Ching-hsuan
- 05 Taiwanese Reading: 100% align with official text <Grandpa's Magic> by Chou Shih-hsiung & audio shadowing
- 06 Mandarin Speech: 100% align with official topics <If a Classmate Did Wrong> & <My Favorite Cartoon Character>
- 07 Taiwanese Situational Speech: integrate official scenario <Lunch Time> (table dumping & floor cleaning reflection)
- Regenerate Word and native PDFs for all categories
- Update school-language-contest-coach skill with zero-assumption official text rule
</commit_message>
<xml_diff>
--- a/115校內語文競賽/四年丙班_各項目培訓資料庫/04_國語朗讀組/老師_指導指引與每日進度表(含評量標準).docx
+++ b/115校內語文競賽/四年丙班_各項目培訓資料庫/04_國語朗讀組/老師_指導指引與每日進度表(含評量標準).docx
@@ -31,7 +31,7 @@
           <w:color w:val="C2410C"/>
           <w:sz w:val="22"/>
         </w:rPr>
-        <w:t>【四年丙班・國語朗讀組】老師指導指引與聲情標記稿（10/5-10/30 完整 20 天）</w:t>
+        <w:t>【四年丙班・國語朗讀組】老師指導指引與進度表（林清玄〈藍蝴蝶〉官方指定篇目）</w:t>
       </w:r>
     </w:p>
     <w:p>
@@ -63,7 +63,7 @@
           <w:color w:val="1E293B"/>
           <w:sz w:val="19"/>
         </w:rPr>
-        <w:t>時間與地點：</w:t>
+        <w:t>時間地點：</w:t>
       </w:r>
       <w:r>
         <w:rPr>
@@ -73,7 +73,33 @@
           <w:color w:val="334155"/>
           <w:sz w:val="19"/>
         </w:rPr>
-        <w:t>115 年 11 月 5 日（四）08:20 抽籤報到，08:30 正式開始（二年甲班教室）。</w:t>
+        <w:t>115 年 11 月 12 日（四）08:10-09:20，活動中心簡報室。</w:t>
+      </w:r>
+    </w:p>
+    <w:p>
+      <w:pPr>
+        <w:pStyle w:val="ListBullet"/>
+        <w:spacing w:before="40" w:after="40"/>
+      </w:pPr>
+      <w:r>
+        <w:rPr>
+          <w:rFonts w:ascii="微軟正黑體" w:hAnsi="微軟正黑體" w:eastAsia="微軟正黑體"/>
+          <w:b/>
+          <w:i w:val="0"/>
+          <w:color w:val="1E293B"/>
+          <w:sz w:val="19"/>
+        </w:rPr>
+        <w:t>競賽時限：</w:t>
+      </w:r>
+      <w:r>
+        <w:rPr>
+          <w:rFonts w:ascii="微軟正黑體" w:hAnsi="微軟正黑體" w:eastAsia="微軟正黑體"/>
+          <w:b w:val="0"/>
+          <w:i w:val="0"/>
+          <w:color w:val="334155"/>
+          <w:sz w:val="19"/>
+        </w:rPr>
+        <w:t>每人限時 2 分鐘（時間一到聞鈴聲一響立即下台，不得繼續朗讀）。</w:t>
       </w:r>
     </w:p>
     <w:p>
@@ -99,7 +125,7 @@
           <w:color w:val="334155"/>
           <w:sz w:val="19"/>
         </w:rPr>
-        <w:t>林清玄〈藍蝴蝶〉（四年級指定篇目，約 400 字）。</w:t>
+        <w:t>林清玄〈藍蝴蝶〉（官方附件一四年級指定篇目，全文約 420 字）。</w:t>
       </w:r>
     </w:p>
     <w:p>
@@ -125,7 +151,33 @@
           <w:color w:val="334155"/>
           <w:sz w:val="19"/>
         </w:rPr>
-        <w:t>語音 50%、聲情 40%、儀態 10%。限時 4 分鐘（3分鐘一響鈴，4分鐘二響鈴下台）。</w:t>
+        <w:t>語音 45%、氣勢 45%、儀態 10%。配速目標 1分45秒 至 1分55秒 完篇。</w:t>
+      </w:r>
+    </w:p>
+    <w:p>
+      <w:pPr>
+        <w:pStyle w:val="ListBullet"/>
+        <w:spacing w:before="40" w:after="40"/>
+      </w:pPr>
+      <w:r>
+        <w:rPr>
+          <w:rFonts w:ascii="微軟正黑體" w:hAnsi="微軟正黑體" w:eastAsia="微軟正黑體"/>
+          <w:b/>
+          <w:i w:val="0"/>
+          <w:color w:val="1E293B"/>
+          <w:sz w:val="19"/>
+        </w:rPr>
+        <w:t>假日自學增量機制：</w:t>
+      </w:r>
+      <w:r>
+        <w:rPr>
+          <w:rFonts w:ascii="微軟正黑體" w:hAnsi="微軟正黑體" w:eastAsia="微軟正黑體"/>
+          <w:b w:val="0"/>
+          <w:i w:val="0"/>
+          <w:color w:val="334155"/>
+          <w:sz w:val="19"/>
+        </w:rPr>
+        <w:t>遇到週末假日改為居家自學與朗讀增量（10~12遍計時精讀），週一晨間抽測檢驗。</w:t>
       </w:r>
     </w:p>
     <w:p>
@@ -141,7 +193,7 @@
           <w:color w:val="0F2C59"/>
           <w:sz w:val="26"/>
         </w:rPr>
-        <w:t>貳、全篇標準聲情符號標記稿（老師示範專用）</w:t>
+        <w:t>貳、全篇聲情標記示範稿（林清玄〈藍蝴蝶〉）</w:t>
       </w:r>
     </w:p>
     <w:p>
@@ -150,16 +202,130 @@
           <w:rFonts w:ascii="微軟正黑體" w:hAnsi="微軟正黑體" w:eastAsia="微軟正黑體"/>
           <w:b w:val="0"/>
           <w:i w:val="0"/>
-          <w:color w:val="1E293B"/>
-          <w:sz w:val="19"/>
+          <w:color w:val="B45309"/>
+          <w:sz w:val="20"/>
         </w:rPr>
-        <w:t>【第一段】清晨，∨走進靜謐(ㄇㄧˋ)的山林，∨微風輕輕(~)拂(ㄈㄨˊ)過樹梢，∨林間薄(ㄅㄛˊ)霧如同一層輕柔(~)的白紗，∨緩緩在林間流淌。∨陽光穿透濃密的樹葉，∨在潮濕的泥土上灑落斑駁陸離的光點(△)。//</w:t>
-        <w:br/>
-        <w:br/>
-        <w:t>【第二段】突然(↗)！∨一抹不可思議的湛(ㄓㄢˋ)藍(△)∨在綠意盎(ㄤˋ)然的草叢間輕盈地閃動。∨那是一隻藍蝴蝶(△)！∨它扇動著薄(ㄅㄠˊ)如蟬翼的雙翅，∨在花草間翩躚(ㄆㄧㄢ ㄒㄧㄢ)起舞(~)。∨那深邃(ㄙㄨㄟˋ)的藍(△)，∨宛如澄澈(ㄔㄥˊ ㄔㄜˋ)晴空的凝縮，∨又似深海波光的蕩漾(~)，∨在晨光中泛著絲綢般柔和而神祕(~)的光澤。∨它輕輕地掠(ㄌㄩㄝˋ)過溪流，∨掠過綠葉，∨每一次展翅，∨都像是在寂靜的天地間劃出一道美麗的弧線(~)！//</w:t>
-        <w:br/>
-        <w:br/>
-        <w:t>【第三段】看著這隻在風中悠然舞動的藍蝴蝶，∨我的心中湧起莫名的感動(△)。∨在這浩瀚遼闊的大自然裡，∨一隻小小的蝴蝶，∨生命的旅程或許短暫(↘)，∨但它卻傾盡全力(△↗)，∨將生命中最燦爛(△)、最純粹(ㄘㄨㄟˋ)的美麗，∨毫無保留地綻(ㄓㄢˋ)放在這片天地之間(△)！∨生命的價值，∨不在於歲月的長短，∨而在於是否曾經用盡全身的力量(△)，∨綻放出屬於自己的獨特光彩(△~)！</w:t>
+        <w:t>【全篇聲情符號標記示範稿】</w:t>
+      </w:r>
+    </w:p>
+    <w:p>
+      <w:r>
+        <w:rPr>
+          <w:rFonts w:ascii="微軟正黑體" w:hAnsi="微軟正黑體" w:eastAsia="微軟正黑體"/>
+          <w:b w:val="0"/>
+          <w:i w:val="0"/>
+          <w:color w:val="0F172A"/>
+          <w:sz w:val="20"/>
+        </w:rPr>
+        <w:t>藍蝴蝶（Lán Hú-dié）↗｜林清玄（Lín Qīng-xuán）↘</w:t>
+      </w:r>
+    </w:p>
+    <w:p>
+      <w:r>
+        <w:rPr>
+          <w:rFonts w:ascii="微軟正黑體" w:hAnsi="微軟正黑體" w:eastAsia="微軟正黑體"/>
+          <w:b w:val="0"/>
+          <w:i w:val="0"/>
+          <w:color w:val="0F172A"/>
+          <w:sz w:val="20"/>
+        </w:rPr>
+        <w:t xml:space="preserve">　　在一個▲狹長的山谷裡，∨住了一群▲白蝴蝶，∨它們居住在溪水邊，∨吸食▲腐木的汁液維生。↘</w:t>
+      </w:r>
+    </w:p>
+    <w:p>
+      <w:r>
+        <w:rPr>
+          <w:rFonts w:ascii="微軟正黑體" w:hAnsi="微軟正黑體" w:eastAsia="微軟正黑體"/>
+          <w:b w:val="0"/>
+          <w:i w:val="0"/>
+          <w:color w:val="0F172A"/>
+          <w:sz w:val="20"/>
+        </w:rPr>
+        <w:t xml:space="preserve">　　有一隻▲毛毛蟲，∨每天看著▲藍天，∨還有藍天下飛過的▲多采多姿的蝴蝶，∨它心裡總是想著：∨「為什麼我▲不能變成一隻藍蝴蝶呢？↗為什麼我不能像多采多姿的蝴蝶一樣，∨以▲採花維生呢？」↗</w:t>
+      </w:r>
+    </w:p>
+    <w:p>
+      <w:r>
+        <w:rPr>
+          <w:rFonts w:ascii="微軟正黑體" w:hAnsi="微軟正黑體" w:eastAsia="微軟正黑體"/>
+          <w:b w:val="0"/>
+          <w:i w:val="0"/>
+          <w:color w:val="0F172A"/>
+          <w:sz w:val="20"/>
+        </w:rPr>
+        <w:t xml:space="preserve">　　於是，∨吃著樹葉的▲空檔，∨別的毛毛蟲都睡了，∨這隻毛毛蟲就▲獨自冥想～，∨想著自己生出▲美麗的藍翅膀，∨在藍天下飛來飛去，∨分不清自己是飛在藍天，∨或者是藍天▲印在自己的翼上。↘每天每天，∨毛毛蟲都這樣▲深深的冥想。↘</w:t>
+      </w:r>
+    </w:p>
+    <w:p>
+      <w:r>
+        <w:rPr>
+          <w:rFonts w:ascii="微軟正黑體" w:hAnsi="微軟正黑體" w:eastAsia="微軟正黑體"/>
+          <w:b w:val="0"/>
+          <w:i w:val="0"/>
+          <w:color w:val="0F172A"/>
+          <w:sz w:val="20"/>
+        </w:rPr>
+        <w:t xml:space="preserve">　　▲奇怪的事終於發生了！↗當所有的毛毛蟲都長出▲白翅膀時，∨那隻毛毛蟲卻長出一對▲藍翅膀，∨藍得～像▲藍天一般。↗</w:t>
+      </w:r>
+    </w:p>
+    <w:p>
+      <w:r>
+        <w:rPr>
+          <w:rFonts w:ascii="微軟正黑體" w:hAnsi="微軟正黑體" w:eastAsia="微軟正黑體"/>
+          <w:b w:val="0"/>
+          <w:i w:val="0"/>
+          <w:color w:val="0F172A"/>
+          <w:sz w:val="20"/>
+        </w:rPr>
+        <w:t xml:space="preserve">　　別的蝴蝶一誕生，∨就飛下土地，∨吸食腐木的汁液。↘只有藍蝴蝶▲一飛沖天！↗在藍天下飛舞，∨從一朶花舞過另一朶花，∨它心裡想著：∨「百花是▲如此的美味，∨為什麼白蝴蝶都不知道呢？↗在天空下飛舞是▲這麼快樂，∨為什麼白蝴蝶都不願意飛舞呢？」↗</w:t>
+      </w:r>
+    </w:p>
+    <w:p>
+      <w:r>
+        <w:rPr>
+          <w:rFonts w:ascii="微軟正黑體" w:hAnsi="微軟正黑體" w:eastAsia="微軟正黑體"/>
+          <w:b w:val="0"/>
+          <w:i w:val="0"/>
+          <w:color w:val="0F172A"/>
+          <w:sz w:val="20"/>
+        </w:rPr>
+        <w:t xml:space="preserve">　　藍蝴蝶一邊▲快樂的飛舞，∨一邊▲冥想，∨希望自己的▲子子孫孫都能化成藍蝴蝶，∨都能飛舞在藍天中，∨吸吮▲百花的芬芳。～</w:t>
+      </w:r>
+    </w:p>
+    <w:p>
+      <w:r>
+        <w:rPr>
+          <w:rFonts w:ascii="微軟正黑體" w:hAnsi="微軟正黑體" w:eastAsia="微軟正黑體"/>
+          <w:b w:val="0"/>
+          <w:i w:val="0"/>
+          <w:color w:val="0F172A"/>
+          <w:sz w:val="20"/>
+        </w:rPr>
+        <w:t xml:space="preserve">　　那些聚居在山谷底部的白蝴蝶▲偶然抬頭，∨看見和自己長得很像的藍蝴蝶，∨在空中轉來轉去，∨都以為自己在▲做夢，∨把藍天▲夢成了翅膀。↘</w:t>
+      </w:r>
+    </w:p>
+    <w:p>
+      <w:r>
+        <w:rPr>
+          <w:rFonts w:ascii="微軟正黑體" w:hAnsi="微軟正黑體" w:eastAsia="微軟正黑體"/>
+          <w:b w:val="0"/>
+          <w:i w:val="0"/>
+          <w:color w:val="0F172A"/>
+          <w:sz w:val="20"/>
+        </w:rPr>
+        <w:t xml:space="preserve">　　許多許多年之後，∨在那狹長的山谷裡，∨住了一群白蝴蝶和一群藍蝴蝶。｜</w:t>
+      </w:r>
+    </w:p>
+    <w:p>
+      <w:r>
+        <w:rPr>
+          <w:rFonts w:ascii="微軟正黑體" w:hAnsi="微軟正黑體" w:eastAsia="微軟正黑體"/>
+          <w:b w:val="0"/>
+          <w:i w:val="0"/>
+          <w:color w:val="0F172A"/>
+          <w:sz w:val="20"/>
+        </w:rPr>
+        <w:t xml:space="preserve">　　白蝴蝶一出生，∨便飛到地上，∨吸食樹木的汁液。↘藍蝴蝶一出生，∨便▲飛上空中，∨在藍天飛舞，∨吸吮百花的芬芳！↗它們▲藍之又藍，∨藍得比它們的祖先—第一隻藍蝴蝶—還要藍！↗它們▲自由自在，∨比第一隻藍蝴蝶飛得▲更高、▲更遠！↗↘</w:t>
       </w:r>
     </w:p>
     <w:p>
@@ -175,7 +341,7 @@
           <w:color w:val="0F2C59"/>
           <w:sz w:val="26"/>
         </w:rPr>
-        <w:t>參、10/5~10/30 每日在校訓練進度與評量標準表（20天上學日全排程）</w:t>
+        <w:t>參、10/5~10/30 每日集訓與週末自學增量進度評量表</w:t>
       </w:r>
     </w:p>
     <w:tbl>
@@ -193,17 +359,18 @@
         </w:tblBorders>
       </w:tblPr>
       <w:tblGrid>
-        <w:gridCol w:w="1704"/>
-        <w:gridCol w:w="1704"/>
-        <w:gridCol w:w="1704"/>
-        <w:gridCol w:w="1704"/>
-        <w:gridCol w:w="1704"/>
-        <w:gridCol w:w="1704"/>
+        <w:gridCol w:w="1461"/>
+        <w:gridCol w:w="1461"/>
+        <w:gridCol w:w="1461"/>
+        <w:gridCol w:w="1461"/>
+        <w:gridCol w:w="1461"/>
+        <w:gridCol w:w="1461"/>
+        <w:gridCol w:w="1461"/>
       </w:tblGrid>
       <w:tr>
         <w:tc>
           <w:tcPr>
-            <w:tcW w:type="dxa" w:w="936"/>
+            <w:tcW w:type="dxa" w:w="1152"/>
             <w:vAlign w:val="center"/>
             <w:tcMar>
               <w:top w:w="50" w:type="dxa"/>
@@ -226,7 +393,7 @@
                 <w:color w:val="FFFFFF"/>
                 <w:sz w:val="18"/>
               </w:rPr>
-              <w:t>天數</w:t>
+              <w:t>天數/週末</w:t>
             </w:r>
           </w:p>
         </w:tc>
@@ -261,7 +428,7 @@
         </w:tc>
         <w:tc>
           <w:tcPr>
-            <w:tcW w:type="dxa" w:w="1728"/>
+            <w:tcW w:type="dxa" w:w="936"/>
             <w:vAlign w:val="center"/>
             <w:tcMar>
               <w:top w:w="50" w:type="dxa"/>
@@ -284,13 +451,13 @@
                 <w:color w:val="FFFFFF"/>
                 <w:sz w:val="18"/>
               </w:rPr>
-              <w:t>訓練焦點</w:t>
+              <w:t>性質</w:t>
             </w:r>
           </w:p>
         </w:tc>
         <w:tc>
           <w:tcPr>
-            <w:tcW w:type="dxa" w:w="3456"/>
+            <w:tcW w:type="dxa" w:w="1872"/>
             <w:vAlign w:val="center"/>
             <w:tcMar>
               <w:top w:w="50" w:type="dxa"/>
@@ -313,13 +480,13 @@
                 <w:color w:val="FFFFFF"/>
                 <w:sz w:val="18"/>
               </w:rPr>
-              <w:t>在校教學重點（早修/午休）</w:t>
+              <w:t>訓練焦點/任務</w:t>
             </w:r>
           </w:p>
         </w:tc>
         <w:tc>
           <w:tcPr>
-            <w:tcW w:type="dxa" w:w="2448"/>
+            <w:tcW w:type="dxa" w:w="3168"/>
             <w:vAlign w:val="center"/>
             <w:tcMar>
               <w:top w:w="50" w:type="dxa"/>
@@ -342,7 +509,36 @@
                 <w:color w:val="FFFFFF"/>
                 <w:sz w:val="18"/>
               </w:rPr>
-              <w:t>每日評量規準</w:t>
+              <w:t>在校教學重點／週末自學指引</w:t>
+            </w:r>
+          </w:p>
+        </w:tc>
+        <w:tc>
+          <w:tcPr>
+            <w:tcW w:type="dxa" w:w="2160"/>
+            <w:vAlign w:val="center"/>
+            <w:tcMar>
+              <w:top w:w="50" w:type="dxa"/>
+              <w:bottom w:w="50" w:type="dxa"/>
+              <w:left w:w="50" w:type="dxa"/>
+              <w:right w:w="50" w:type="dxa"/>
+            </w:tcMar>
+            <w:shd w:fill="1E3A8A"/>
+          </w:tcPr>
+          <w:p>
+            <w:pPr>
+              <w:spacing w:before="0" w:after="0"/>
+              <w:jc w:val="center"/>
+            </w:pPr>
+            <w:r>
+              <w:rPr>
+                <w:rFonts w:ascii="微軟正黑體" w:hAnsi="微軟正黑體" w:eastAsia="微軟正黑體"/>
+                <w:b/>
+                <w:i w:val="0"/>
+                <w:color w:val="FFFFFF"/>
+                <w:sz w:val="18"/>
+              </w:rPr>
+              <w:t>評量指標規準</w:t>
             </w:r>
           </w:p>
         </w:tc>
@@ -379,7 +575,7 @@
       <w:tr>
         <w:tc>
           <w:tcPr>
-            <w:tcW w:type="dxa" w:w="936"/>
+            <w:tcW w:type="dxa" w:w="1152"/>
             <w:vAlign w:val="center"/>
             <w:tcMar>
               <w:top w:w="50" w:type="dxa"/>
@@ -437,7 +633,7 @@
         </w:tc>
         <w:tc>
           <w:tcPr>
-            <w:tcW w:type="dxa" w:w="1728"/>
+            <w:tcW w:type="dxa" w:w="936"/>
             <w:vAlign w:val="center"/>
             <w:tcMar>
               <w:top w:w="50" w:type="dxa"/>
@@ -460,13 +656,13 @@
                 <w:color w:val="1E293B"/>
                 <w:sz w:val="17"/>
               </w:rPr>
-              <w:t>儀態奠基與篇名作者正音</w:t>
+              <w:t>在校集訓</w:t>
             </w:r>
           </w:p>
         </w:tc>
         <w:tc>
           <w:tcPr>
-            <w:tcW w:type="dxa" w:w="3456"/>
+            <w:tcW w:type="dxa" w:w="1872"/>
             <w:vAlign w:val="center"/>
             <w:tcMar>
               <w:top w:w="50" w:type="dxa"/>
@@ -489,15 +685,42 @@
                 <w:color w:val="1E293B"/>
                 <w:sz w:val="17"/>
               </w:rPr>
-              <w:t>【早修】指導上台儀態：立正站姿、挺胸沉肩、雙手持稿呈 45 度角（不遮擋臉部與嘴唇）。篇名〈藍蝴蝶〉與作者「林清玄（ㄌㄧㄣˊ ㄑㄧㄥ ㄒㄩㄢˊ）」標準發音，要求字正腔圓、氣息充沛。</w:t>
-              <w:br/>
-              <w:t>【午休】個別校正站姿與視線，指導持稿手勢，練習深吸慢呼之腹式呼吸法。</w:t>
+              <w:t>儀態奠基與篇名作者正音...</w:t>
             </w:r>
           </w:p>
         </w:tc>
         <w:tc>
           <w:tcPr>
-            <w:tcW w:type="dxa" w:w="2448"/>
+            <w:tcW w:type="dxa" w:w="3168"/>
+            <w:vAlign w:val="center"/>
+            <w:tcMar>
+              <w:top w:w="50" w:type="dxa"/>
+              <w:bottom w:w="50" w:type="dxa"/>
+              <w:left w:w="50" w:type="dxa"/>
+              <w:right w:w="50" w:type="dxa"/>
+            </w:tcMar>
+            <w:shd w:fill="F8FAFC"/>
+          </w:tcPr>
+          <w:p>
+            <w:pPr>
+              <w:spacing w:before="0" w:after="0"/>
+              <w:jc w:val="left"/>
+            </w:pPr>
+            <w:r>
+              <w:rPr>
+                <w:rFonts w:ascii="微軟正黑體" w:hAnsi="微軟正黑體" w:eastAsia="微軟正黑體"/>
+                <w:b w:val="0"/>
+                <w:i w:val="0"/>
+                <w:color w:val="1E293B"/>
+                <w:sz w:val="17"/>
+              </w:rPr>
+              <w:t>指導上台儀態：立正站姿、挺胸沉肩、雙手持稿呈 45 度角。篇名〈藍蝴蝶〉與作者「林清玄」標準發音，要求字正腔圓、氣息充沛。</w:t>
+            </w:r>
+          </w:p>
+        </w:tc>
+        <w:tc>
+          <w:tcPr>
+            <w:tcW w:type="dxa" w:w="2160"/>
             <w:vAlign w:val="center"/>
             <w:tcMar>
               <w:top w:w="50" w:type="dxa"/>
@@ -552,8 +775,6 @@
               <w:t>［ ］優</w:t>
               <w:br/>
               <w:t>［ ］良</w:t>
-              <w:br/>
-              <w:t>［ ］可</w:t>
             </w:r>
           </w:p>
         </w:tc>
@@ -561,7 +782,7 @@
       <w:tr>
         <w:tc>
           <w:tcPr>
-            <w:tcW w:type="dxa" w:w="936"/>
+            <w:tcW w:type="dxa" w:w="1152"/>
             <w:vAlign w:val="center"/>
             <w:tcMar>
               <w:top w:w="50" w:type="dxa"/>
@@ -617,7 +838,7 @@
         </w:tc>
         <w:tc>
           <w:tcPr>
-            <w:tcW w:type="dxa" w:w="1728"/>
+            <w:tcW w:type="dxa" w:w="936"/>
             <w:vAlign w:val="center"/>
             <w:tcMar>
               <w:top w:w="50" w:type="dxa"/>
@@ -639,13 +860,13 @@
                 <w:color w:val="1E293B"/>
                 <w:sz w:val="17"/>
               </w:rPr>
-              <w:t>第一段生字精準正音</w:t>
+              <w:t>在校集訓</w:t>
             </w:r>
           </w:p>
         </w:tc>
         <w:tc>
           <w:tcPr>
-            <w:tcW w:type="dxa" w:w="3456"/>
+            <w:tcW w:type="dxa" w:w="1872"/>
             <w:vAlign w:val="center"/>
             <w:tcMar>
               <w:top w:w="50" w:type="dxa"/>
@@ -667,15 +888,13 @@
                 <w:color w:val="1E293B"/>
                 <w:sz w:val="17"/>
               </w:rPr>
-              <w:t>【早修】第一段生字正音：靜「謐」(ㄇㄧˋ，勿讀ㄅㄧˋ)、「拂」(ㄈㄨˊ，勿讀ㄈㄛˊ)過、「梢」(ㄕㄠ)、「流淌」(ㄌㄧㄡˊ ㄊㄤˇ)、「斑駁」(ㄅㄢ ㄅㄛˊ)、「陸」(ㄌㄨˋ)離。</w:t>
-              <w:br/>
-              <w:t>【午休】逐句聽讀學生第一段，糾正咬字不緊或唇齒無力問題，要求每個音節清晰飽滿。</w:t>
+              <w:t>第一、二段生字精準正音...</w:t>
             </w:r>
           </w:p>
         </w:tc>
         <w:tc>
           <w:tcPr>
-            <w:tcW w:type="dxa" w:w="2448"/>
+            <w:tcW w:type="dxa" w:w="3168"/>
             <w:vAlign w:val="center"/>
             <w:tcMar>
               <w:top w:w="50" w:type="dxa"/>
@@ -697,7 +916,35 @@
                 <w:color w:val="1E293B"/>
                 <w:sz w:val="17"/>
               </w:rPr>
-              <w:t>第一段所有生字發音 100% 正確，無含糊不清或方言腔調。</w:t>
+              <w:t>第1-2段生字正音：狹(ㄒㄧㄚˊ)長、腐(ㄈㄨˇ)木、汁(ㄓ)液(ㄧㄝˋ)、多采多姿(ㄗ)。辨析汁液與腐木之唇齒音與舌尖音。</w:t>
+            </w:r>
+          </w:p>
+        </w:tc>
+        <w:tc>
+          <w:tcPr>
+            <w:tcW w:type="dxa" w:w="2160"/>
+            <w:vAlign w:val="center"/>
+            <w:tcMar>
+              <w:top w:w="50" w:type="dxa"/>
+              <w:bottom w:w="50" w:type="dxa"/>
+              <w:left w:w="50" w:type="dxa"/>
+              <w:right w:w="50" w:type="dxa"/>
+            </w:tcMar>
+          </w:tcPr>
+          <w:p>
+            <w:pPr>
+              <w:spacing w:before="0" w:after="0"/>
+              <w:jc w:val="left"/>
+            </w:pPr>
+            <w:r>
+              <w:rPr>
+                <w:rFonts w:ascii="微軟正黑體" w:hAnsi="微軟正黑體" w:eastAsia="微軟正黑體"/>
+                <w:b w:val="0"/>
+                <w:i w:val="0"/>
+                <w:color w:val="1E293B"/>
+                <w:sz w:val="17"/>
+              </w:rPr>
+              <w:t>第1-2段生字發音 100% 正確，無方言腔調或走音。</w:t>
             </w:r>
           </w:p>
         </w:tc>
@@ -728,8 +975,6 @@
               <w:t>［ ］優</w:t>
               <w:br/>
               <w:t>［ ］良</w:t>
-              <w:br/>
-              <w:t>［ ］可</w:t>
             </w:r>
           </w:p>
         </w:tc>
@@ -737,7 +982,7 @@
       <w:tr>
         <w:tc>
           <w:tcPr>
-            <w:tcW w:type="dxa" w:w="936"/>
+            <w:tcW w:type="dxa" w:w="1152"/>
             <w:vAlign w:val="center"/>
             <w:tcMar>
               <w:top w:w="50" w:type="dxa"/>
@@ -795,7 +1040,7 @@
         </w:tc>
         <w:tc>
           <w:tcPr>
-            <w:tcW w:type="dxa" w:w="1728"/>
+            <w:tcW w:type="dxa" w:w="936"/>
             <w:vAlign w:val="center"/>
             <w:tcMar>
               <w:top w:w="50" w:type="dxa"/>
@@ -818,13 +1063,13 @@
                 <w:color w:val="1E293B"/>
                 <w:sz w:val="17"/>
               </w:rPr>
-              <w:t>多音字辨析與兒化輕聲</w:t>
+              <w:t>在校集訓</w:t>
             </w:r>
           </w:p>
         </w:tc>
         <w:tc>
           <w:tcPr>
-            <w:tcW w:type="dxa" w:w="3456"/>
+            <w:tcW w:type="dxa" w:w="1872"/>
             <w:vAlign w:val="center"/>
             <w:tcMar>
               <w:top w:w="50" w:type="dxa"/>
@@ -847,15 +1092,13 @@
                 <w:color w:val="1E293B"/>
                 <w:sz w:val="17"/>
               </w:rPr>
-              <w:t>【早修】多音字專題精講：透「穿透(ㄊㄡˋ)」、「灑落(ㄌㄨㄛˋ，勿讀ㄌㄠˋ)」、「薄(ㄅㄠˊ)霧/薄(ㄅㄛˊ)如蟬翼」。輕聲處理：「樹葉(ㄧㄝˋ)」、「光點(ㄉㄧㄢˇ)」。</w:t>
-              <w:br/>
-              <w:t>【午休】透過對比朗讀，讓學生體會「薄霧」讀ㄅㄛˊ/ㄅㄠˊ之語感，確保符合教育部標準音。</w:t>
+              <w:t>第二段毛毛蟲疑問句聲情表現...</w:t>
             </w:r>
           </w:p>
         </w:tc>
         <w:tc>
           <w:tcPr>
-            <w:tcW w:type="dxa" w:w="2448"/>
+            <w:tcW w:type="dxa" w:w="3168"/>
             <w:vAlign w:val="center"/>
             <w:tcMar>
               <w:top w:w="50" w:type="dxa"/>
@@ -878,7 +1121,36 @@
                 <w:color w:val="1E293B"/>
                 <w:sz w:val="17"/>
               </w:rPr>
-              <w:t>多音字辨析無誤，輕聲與兒化自然流暢，不顯刻意造作。</w:t>
+              <w:t>指導毛毛蟲內心獨白之聲情：兩個設問句「為什麼我不能變成一隻藍蝴蝶呢？」、「為什麼我不能像多采多姿的蝴蝶一樣……」語尾自然上揚，展現孩童般的純真憧憬與渴望。</w:t>
+            </w:r>
+          </w:p>
+        </w:tc>
+        <w:tc>
+          <w:tcPr>
+            <w:tcW w:type="dxa" w:w="2160"/>
+            <w:vAlign w:val="center"/>
+            <w:tcMar>
+              <w:top w:w="50" w:type="dxa"/>
+              <w:bottom w:w="50" w:type="dxa"/>
+              <w:left w:w="50" w:type="dxa"/>
+              <w:right w:w="50" w:type="dxa"/>
+            </w:tcMar>
+            <w:shd w:fill="F8FAFC"/>
+          </w:tcPr>
+          <w:p>
+            <w:pPr>
+              <w:spacing w:before="0" w:after="0"/>
+              <w:jc w:val="left"/>
+            </w:pPr>
+            <w:r>
+              <w:rPr>
+                <w:rFonts w:ascii="微軟正黑體" w:hAnsi="微軟正黑體" w:eastAsia="微軟正黑體"/>
+                <w:b w:val="0"/>
+                <w:i w:val="0"/>
+                <w:color w:val="1E293B"/>
+                <w:sz w:val="17"/>
+              </w:rPr>
+              <w:t>設問句語氣上揚自然，聲情富有向往與純真感染力。</w:t>
             </w:r>
           </w:p>
         </w:tc>
@@ -910,8 +1182,6 @@
               <w:t>［ ］優</w:t>
               <w:br/>
               <w:t>［ ］良</w:t>
-              <w:br/>
-              <w:t>［ ］可</w:t>
             </w:r>
           </w:p>
         </w:tc>
@@ -919,7 +1189,7 @@
       <w:tr>
         <w:tc>
           <w:tcPr>
-            <w:tcW w:type="dxa" w:w="936"/>
+            <w:tcW w:type="dxa" w:w="1152"/>
             <w:vAlign w:val="center"/>
             <w:tcMar>
               <w:top w:w="50" w:type="dxa"/>
@@ -975,7 +1245,7 @@
         </w:tc>
         <w:tc>
           <w:tcPr>
-            <w:tcW w:type="dxa" w:w="1728"/>
+            <w:tcW w:type="dxa" w:w="936"/>
             <w:vAlign w:val="center"/>
             <w:tcMar>
               <w:top w:w="50" w:type="dxa"/>
@@ -997,13 +1267,13 @@
                 <w:color w:val="1E293B"/>
                 <w:sz w:val="17"/>
               </w:rPr>
-              <w:t>第一段斷句與呼吸換氣點標記</w:t>
+              <w:t>在校集訓</w:t>
             </w:r>
           </w:p>
         </w:tc>
         <w:tc>
           <w:tcPr>
-            <w:tcW w:type="dxa" w:w="3456"/>
+            <w:tcW w:type="dxa" w:w="1872"/>
             <w:vAlign w:val="center"/>
             <w:tcMar>
               <w:top w:w="50" w:type="dxa"/>
@@ -1025,15 +1295,41 @@
                 <w:color w:val="1E293B"/>
                 <w:sz w:val="17"/>
               </w:rPr>
-              <w:t>【早修】指導「換氣點標記法」：在意義單位（意群）之間劃上換氣符號（∨）。切忌在名詞中間突兀斷氣（如「微風／輕輕／拂過」不可讀成「微／風輕／輕拂」）。</w:t>
-              <w:br/>
-              <w:t>【午休】帶領學生劃定第一段 4 處最佳換氣點，示範「偷氣」技巧（快速深吸，不產生吸氣雜音）。</w:t>
+              <w:t>第1-2段斷句與呼吸換氣點標...</w:t>
             </w:r>
           </w:p>
         </w:tc>
         <w:tc>
           <w:tcPr>
-            <w:tcW w:type="dxa" w:w="2448"/>
+            <w:tcW w:type="dxa" w:w="3168"/>
+            <w:vAlign w:val="center"/>
+            <w:tcMar>
+              <w:top w:w="50" w:type="dxa"/>
+              <w:bottom w:w="50" w:type="dxa"/>
+              <w:left w:w="50" w:type="dxa"/>
+              <w:right w:w="50" w:type="dxa"/>
+            </w:tcMar>
+          </w:tcPr>
+          <w:p>
+            <w:pPr>
+              <w:spacing w:before="0" w:after="0"/>
+              <w:jc w:val="left"/>
+            </w:pPr>
+            <w:r>
+              <w:rPr>
+                <w:rFonts w:ascii="微軟正黑體" w:hAnsi="微軟正黑體" w:eastAsia="微軟正黑體"/>
+                <w:b w:val="0"/>
+                <w:i w:val="0"/>
+                <w:color w:val="1E293B"/>
+                <w:sz w:val="17"/>
+              </w:rPr>
+              <w:t>指導「換氣點標記法」：在意義單位之間劃上換氣符號（∨）。「在一個狹長的山谷裡，∨住了一群白蝴蝶，∨它們居住在溪水邊，∨吸食腐木的汁液維生。↘」切忌在名詞中間突兀吸氣。</w:t>
+            </w:r>
+          </w:p>
+        </w:tc>
+        <w:tc>
+          <w:tcPr>
+            <w:tcW w:type="dxa" w:w="2160"/>
             <w:vAlign w:val="center"/>
             <w:tcMar>
               <w:top w:w="50" w:type="dxa"/>
@@ -1086,8 +1382,6 @@
               <w:t>［ ］優</w:t>
               <w:br/>
               <w:t>［ ］良</w:t>
-              <w:br/>
-              <w:t>［ ］可</w:t>
             </w:r>
           </w:p>
         </w:tc>
@@ -1095,7 +1389,7 @@
       <w:tr>
         <w:tc>
           <w:tcPr>
-            <w:tcW w:type="dxa" w:w="936"/>
+            <w:tcW w:type="dxa" w:w="1152"/>
             <w:vAlign w:val="center"/>
             <w:tcMar>
               <w:top w:w="50" w:type="dxa"/>
@@ -1153,7 +1447,7 @@
         </w:tc>
         <w:tc>
           <w:tcPr>
-            <w:tcW w:type="dxa" w:w="1728"/>
+            <w:tcW w:type="dxa" w:w="936"/>
             <w:vAlign w:val="center"/>
             <w:tcMar>
               <w:top w:w="50" w:type="dxa"/>
@@ -1176,13 +1470,13 @@
                 <w:color w:val="1E293B"/>
                 <w:sz w:val="17"/>
               </w:rPr>
-              <w:t>第一段意境聲情與第 1 週驗收</w:t>
+              <w:t>在校集訓</w:t>
             </w:r>
           </w:p>
         </w:tc>
         <w:tc>
           <w:tcPr>
-            <w:tcW w:type="dxa" w:w="3456"/>
+            <w:tcW w:type="dxa" w:w="1872"/>
             <w:vAlign w:val="center"/>
             <w:tcMar>
               <w:top w:w="50" w:type="dxa"/>
@@ -1205,15 +1499,13 @@
                 <w:color w:val="1E293B"/>
                 <w:sz w:val="17"/>
               </w:rPr>
-              <w:t>【早修】第一段聲情渲染：營造「清晨山林的寧靜祥和」。語氣放柔、語調微平緩、音色純淨，如清泉流淌。執行第 1 週第一段驗收。</w:t>
-              <w:br/>
-              <w:t>【午休】逐一驗收學生第一段朗讀，針對語速過急進行降速引導，強調畫面感的鋪展。</w:t>
+              <w:t>第1-2段意境連貫與第 1 ...</w:t>
             </w:r>
           </w:p>
         </w:tc>
         <w:tc>
           <w:tcPr>
-            <w:tcW w:type="dxa" w:w="2448"/>
+            <w:tcW w:type="dxa" w:w="3168"/>
             <w:vAlign w:val="center"/>
             <w:tcMar>
               <w:top w:w="50" w:type="dxa"/>
@@ -1236,7 +1528,36 @@
                 <w:color w:val="1E293B"/>
                 <w:sz w:val="17"/>
               </w:rPr>
-              <w:t>能用柔和純淨的音色表現森林清晨之靜謐，語速適中（每分鐘約 110-120 字）。</w:t>
+              <w:t>第1-2段整體聲情貫通：從山谷溪邊的平靜敘述，到毛毛蟲仰望藍天的驚艷與夢想。執行第 1 週驗收。</w:t>
+            </w:r>
+          </w:p>
+        </w:tc>
+        <w:tc>
+          <w:tcPr>
+            <w:tcW w:type="dxa" w:w="2160"/>
+            <w:vAlign w:val="center"/>
+            <w:tcMar>
+              <w:top w:w="50" w:type="dxa"/>
+              <w:bottom w:w="50" w:type="dxa"/>
+              <w:left w:w="50" w:type="dxa"/>
+              <w:right w:w="50" w:type="dxa"/>
+            </w:tcMar>
+            <w:shd w:fill="F8FAFC"/>
+          </w:tcPr>
+          <w:p>
+            <w:pPr>
+              <w:spacing w:before="0" w:after="0"/>
+              <w:jc w:val="left"/>
+            </w:pPr>
+            <w:r>
+              <w:rPr>
+                <w:rFonts w:ascii="微軟正黑體" w:hAnsi="微軟正黑體" w:eastAsia="微軟正黑體"/>
+                <w:b w:val="0"/>
+                <w:i w:val="0"/>
+                <w:color w:val="1E293B"/>
+                <w:sz w:val="17"/>
+              </w:rPr>
+              <w:t>能用柔和純淨的音色表現山谷平靜，語調轉換自然，語速適中。</w:t>
             </w:r>
           </w:p>
         </w:tc>
@@ -1268,8 +1589,6 @@
               <w:t>［ ］優</w:t>
               <w:br/>
               <w:t>［ ］良</w:t>
-              <w:br/>
-              <w:t>［ ］可</w:t>
             </w:r>
           </w:p>
         </w:tc>
@@ -1277,7 +1596,7 @@
       <w:tr>
         <w:tc>
           <w:tcPr>
-            <w:tcW w:type="dxa" w:w="936"/>
+            <w:tcW w:type="dxa" w:w="1152"/>
             <w:vAlign w:val="center"/>
             <w:tcMar>
               <w:top w:w="50" w:type="dxa"/>
@@ -1299,7 +1618,7 @@
                 <w:color w:val="1E293B"/>
                 <w:sz w:val="17"/>
               </w:rPr>
-              <w:t>Day 06</w:t>
+              <w:t>週末假日一</w:t>
             </w:r>
           </w:p>
         </w:tc>
@@ -1327,13 +1646,13 @@
                 <w:color w:val="1E293B"/>
                 <w:sz w:val="17"/>
               </w:rPr>
-              <w:t>10/12 (一)</w:t>
+              <w:t>10/10 (六) ~ 10/11 (日)</w:t>
             </w:r>
           </w:p>
         </w:tc>
         <w:tc>
           <w:tcPr>
-            <w:tcW w:type="dxa" w:w="1728"/>
+            <w:tcW w:type="dxa" w:w="936"/>
             <w:vAlign w:val="center"/>
             <w:tcMar>
               <w:top w:w="50" w:type="dxa"/>
@@ -1355,13 +1674,13 @@
                 <w:color w:val="1E293B"/>
                 <w:sz w:val="17"/>
               </w:rPr>
-              <w:t>第二段生字正音：色彩與動態詞</w:t>
+              <w:t>假日自學增量</w:t>
             </w:r>
           </w:p>
         </w:tc>
         <w:tc>
           <w:tcPr>
-            <w:tcW w:type="dxa" w:w="3456"/>
+            <w:tcW w:type="dxa" w:w="1872"/>
             <w:vAlign w:val="center"/>
             <w:tcMar>
               <w:top w:w="50" w:type="dxa"/>
@@ -1383,15 +1702,13 @@
                 <w:color w:val="1E293B"/>
                 <w:sz w:val="17"/>
               </w:rPr>
-              <w:t>【早修】第二段生字正音：湛(ㄓㄢˋ)藍、盎(ㄤˋ)然、蟬翼(ㄧˋ)、翩躚(ㄆㄧㄢ ㄒㄧㄢ)、深邃(ㄙㄨㄟˋ)、澄澈(ㄔㄥˊ ㄔㄜˋ)、蕩漾(ㄉㄤˋ ㄧㄤˋ)。</w:t>
-              <w:br/>
-              <w:t>【午休】重點攻堅「翩躚(ㄆㄧㄢ ㄒㄧㄢ)」，糾正讀成ㄆㄧㄢ ㄑㄧㄢ；「澄澈(ㄔㄥˊ ㄔㄜˋ)」之翹舌音。</w:t>
+              <w:t>【假日自主自學與朗讀增量 A...</w:t>
             </w:r>
           </w:p>
         </w:tc>
         <w:tc>
           <w:tcPr>
-            <w:tcW w:type="dxa" w:w="2448"/>
+            <w:tcW w:type="dxa" w:w="3168"/>
             <w:vAlign w:val="center"/>
             <w:tcMar>
               <w:top w:w="50" w:type="dxa"/>
@@ -1413,7 +1730,35 @@
                 <w:color w:val="1E293B"/>
                 <w:sz w:val="17"/>
               </w:rPr>
-              <w:t>生字全部讀準，尤其是「翩躚、澄澈、深邃」，發音清晰無黏連。</w:t>
+              <w:t>【週末自學指引】週末無在校實體課，全面啟動「自主自學增量」機制：1. 第1-2段完整熟讀 10 遍；2. 親手標記無注音文稿；3. 家長錄影回傳。</w:t>
+            </w:r>
+          </w:p>
+        </w:tc>
+        <w:tc>
+          <w:tcPr>
+            <w:tcW w:type="dxa" w:w="2160"/>
+            <w:vAlign w:val="center"/>
+            <w:tcMar>
+              <w:top w:w="50" w:type="dxa"/>
+              <w:bottom w:w="50" w:type="dxa"/>
+              <w:left w:w="50" w:type="dxa"/>
+              <w:right w:w="50" w:type="dxa"/>
+            </w:tcMar>
+          </w:tcPr>
+          <w:p>
+            <w:pPr>
+              <w:spacing w:before="0" w:after="0"/>
+              <w:jc w:val="left"/>
+            </w:pPr>
+            <w:r>
+              <w:rPr>
+                <w:rFonts w:ascii="微軟正黑體" w:hAnsi="微軟正黑體" w:eastAsia="微軟正黑體"/>
+                <w:b w:val="0"/>
+                <w:i w:val="0"/>
+                <w:color w:val="1E293B"/>
+                <w:sz w:val="17"/>
+              </w:rPr>
+              <w:t>【特優】字音全對且設問句情感豐富；【優等】字音正確但抬頭稍少；【尚可】仍有 1 處讀音停頓。</w:t>
             </w:r>
           </w:p>
         </w:tc>
@@ -1444,8 +1789,6 @@
               <w:t>［ ］優</w:t>
               <w:br/>
               <w:t>［ ］良</w:t>
-              <w:br/>
-              <w:t>［ ］可</w:t>
             </w:r>
           </w:p>
         </w:tc>
@@ -1453,7 +1796,7 @@
       <w:tr>
         <w:tc>
           <w:tcPr>
-            <w:tcW w:type="dxa" w:w="936"/>
+            <w:tcW w:type="dxa" w:w="1152"/>
             <w:vAlign w:val="center"/>
             <w:tcMar>
               <w:top w:w="50" w:type="dxa"/>
@@ -1476,7 +1819,7 @@
                 <w:color w:val="1E293B"/>
                 <w:sz w:val="17"/>
               </w:rPr>
-              <w:t>Day 07</w:t>
+              <w:t>Day 06</w:t>
             </w:r>
           </w:p>
         </w:tc>
@@ -1505,13 +1848,13 @@
                 <w:color w:val="1E293B"/>
                 <w:sz w:val="17"/>
               </w:rPr>
-              <w:t>10/13 (二)</w:t>
+              <w:t>10/12 (一)</w:t>
             </w:r>
           </w:p>
         </w:tc>
         <w:tc>
           <w:tcPr>
-            <w:tcW w:type="dxa" w:w="1728"/>
+            <w:tcW w:type="dxa" w:w="936"/>
             <w:vAlign w:val="center"/>
             <w:tcMar>
               <w:top w:w="50" w:type="dxa"/>
@@ -1534,13 +1877,13 @@
                 <w:color w:val="1E293B"/>
                 <w:sz w:val="17"/>
               </w:rPr>
-              <w:t>聲音的明暗對比：發現蝴蝶的驚喜</w:t>
+              <w:t>在校集訓</w:t>
             </w:r>
           </w:p>
         </w:tc>
         <w:tc>
           <w:tcPr>
-            <w:tcW w:type="dxa" w:w="3456"/>
+            <w:tcW w:type="dxa" w:w="1872"/>
             <w:vAlign w:val="center"/>
             <w:tcMar>
               <w:top w:w="50" w:type="dxa"/>
@@ -1563,15 +1906,13 @@
                 <w:color w:val="1E293B"/>
                 <w:sz w:val="17"/>
               </w:rPr>
-              <w:t>【早修】情感情緒轉折：從第一段的「靜」瞬間轉入第二段「突然，一抹不可思議的湛藍……」的「喜悅與驚嘆」。音調拉高、眼神明亮、語調上揚（↗）。</w:t>
-              <w:br/>
-              <w:t>【午休】示範「那是一隻藍蝴蝶！」之感嘆語氣，不可平淡如念經，要傳遞出發自內心的喜悅與震撼。</w:t>
+              <w:t>第三段生字正音：冥(ㄇㄧㄥˊ...</w:t>
             </w:r>
           </w:p>
         </w:tc>
         <w:tc>
           <w:tcPr>
-            <w:tcW w:type="dxa" w:w="2448"/>
+            <w:tcW w:type="dxa" w:w="3168"/>
             <w:vAlign w:val="center"/>
             <w:tcMar>
               <w:top w:w="50" w:type="dxa"/>
@@ -1594,7 +1935,36 @@
                 <w:color w:val="1E293B"/>
                 <w:sz w:val="17"/>
               </w:rPr>
-              <w:t>情緒轉換分明，能透過聲音亮度的提升展現驚奇與喜悅之情。</w:t>
+              <w:t>第三段生字正音：空檔(ㄉㄤˋ，多音字注意去聲)、冥(ㄇㄧㄥˊ)想、翼(ㄧˋ)上。解釋「冥想」的意境與發音要領。</w:t>
+            </w:r>
+          </w:p>
+        </w:tc>
+        <w:tc>
+          <w:tcPr>
+            <w:tcW w:type="dxa" w:w="2160"/>
+            <w:vAlign w:val="center"/>
+            <w:tcMar>
+              <w:top w:w="50" w:type="dxa"/>
+              <w:bottom w:w="50" w:type="dxa"/>
+              <w:left w:w="50" w:type="dxa"/>
+              <w:right w:w="50" w:type="dxa"/>
+            </w:tcMar>
+            <w:shd w:fill="F8FAFC"/>
+          </w:tcPr>
+          <w:p>
+            <w:pPr>
+              <w:spacing w:before="0" w:after="0"/>
+              <w:jc w:val="left"/>
+            </w:pPr>
+            <w:r>
+              <w:rPr>
+                <w:rFonts w:ascii="微軟正黑體" w:hAnsi="微軟正黑體" w:eastAsia="微軟正黑體"/>
+                <w:b w:val="0"/>
+                <w:i w:val="0"/>
+                <w:color w:val="1E293B"/>
+                <w:sz w:val="17"/>
+              </w:rPr>
+              <w:t>生字注音精確，「空檔」、「冥想」讀音無誤。</w:t>
             </w:r>
           </w:p>
         </w:tc>
@@ -1626,8 +1996,6 @@
               <w:t>［ ］優</w:t>
               <w:br/>
               <w:t>［ ］良</w:t>
-              <w:br/>
-              <w:t>［ ］可</w:t>
             </w:r>
           </w:p>
         </w:tc>
@@ -1635,7 +2003,7 @@
       <w:tr>
         <w:tc>
           <w:tcPr>
-            <w:tcW w:type="dxa" w:w="936"/>
+            <w:tcW w:type="dxa" w:w="1152"/>
             <w:vAlign w:val="center"/>
             <w:tcMar>
               <w:top w:w="50" w:type="dxa"/>
@@ -1657,7 +2025,7 @@
                 <w:color w:val="1E293B"/>
                 <w:sz w:val="17"/>
               </w:rPr>
-              <w:t>Day 08</w:t>
+              <w:t>Day 07</w:t>
             </w:r>
           </w:p>
         </w:tc>
@@ -1685,13 +2053,13 @@
                 <w:color w:val="1E293B"/>
                 <w:sz w:val="17"/>
               </w:rPr>
-              <w:t>10/14 (三)</w:t>
+              <w:t>10/13 (二)</w:t>
             </w:r>
           </w:p>
         </w:tc>
         <w:tc>
           <w:tcPr>
-            <w:tcW w:type="dxa" w:w="1728"/>
+            <w:tcW w:type="dxa" w:w="936"/>
             <w:vAlign w:val="center"/>
             <w:tcMar>
               <w:top w:w="50" w:type="dxa"/>
@@ -1713,13 +2081,13 @@
                 <w:color w:val="1E293B"/>
                 <w:sz w:val="17"/>
               </w:rPr>
-              <w:t>動詞重音與節奏快慢變化</w:t>
+              <w:t>在校集訓</w:t>
             </w:r>
           </w:p>
         </w:tc>
         <w:tc>
           <w:tcPr>
-            <w:tcW w:type="dxa" w:w="3456"/>
+            <w:tcW w:type="dxa" w:w="1872"/>
             <w:vAlign w:val="center"/>
             <w:tcMar>
               <w:top w:w="50" w:type="dxa"/>
@@ -1741,15 +2109,13 @@
                 <w:color w:val="1E293B"/>
                 <w:sz w:val="17"/>
               </w:rPr>
-              <w:t>【早修】動詞重音處理：「扇動、翩躚起舞、泛著、掠過、劃出」。描寫蝴蝶飛舞時語速稍加快，展現輕靈躍動之感。</w:t>
-              <w:br/>
-              <w:t>【午休】指導學生在課文動詞下方標記重音符號（△），示範「掠過溪流，掠過綠葉」的排比節奏感。</w:t>
+              <w:t>第三段夢幻意境營造：分不清是...</w:t>
             </w:r>
           </w:p>
         </w:tc>
         <w:tc>
           <w:tcPr>
-            <w:tcW w:type="dxa" w:w="2448"/>
+            <w:tcW w:type="dxa" w:w="3168"/>
             <w:vAlign w:val="center"/>
             <w:tcMar>
               <w:top w:w="50" w:type="dxa"/>
@@ -1771,7 +2137,35 @@
                 <w:color w:val="1E293B"/>
                 <w:sz w:val="17"/>
               </w:rPr>
-              <w:t>重音落點精準，動詞富有彈性活力，節奏快慢對比鮮明。</w:t>
+              <w:t>指導第三段語速調控：此段寫毛毛蟲的冥想世界，語速需降至每分鐘 100 字，聲音要輕柔、如夢如幻，重音落在「美麗的藍翅膀」、「印在自己的翼上」。</w:t>
+            </w:r>
+          </w:p>
+        </w:tc>
+        <w:tc>
+          <w:tcPr>
+            <w:tcW w:type="dxa" w:w="2160"/>
+            <w:vAlign w:val="center"/>
+            <w:tcMar>
+              <w:top w:w="50" w:type="dxa"/>
+              <w:bottom w:w="50" w:type="dxa"/>
+              <w:left w:w="50" w:type="dxa"/>
+              <w:right w:w="50" w:type="dxa"/>
+            </w:tcMar>
+          </w:tcPr>
+          <w:p>
+            <w:pPr>
+              <w:spacing w:before="0" w:after="0"/>
+              <w:jc w:val="left"/>
+            </w:pPr>
+            <w:r>
+              <w:rPr>
+                <w:rFonts w:ascii="微軟正黑體" w:hAnsi="微軟正黑體" w:eastAsia="微軟正黑體"/>
+                <w:b w:val="0"/>
+                <w:i w:val="0"/>
+                <w:color w:val="1E293B"/>
+                <w:sz w:val="17"/>
+              </w:rPr>
+              <w:t>語調輕柔夢幻，語速沉穩，能傳遞出如詩一般的冥想意境。</w:t>
             </w:r>
           </w:p>
         </w:tc>
@@ -1802,8 +2196,6 @@
               <w:t>［ ］優</w:t>
               <w:br/>
               <w:t>［ ］良</w:t>
-              <w:br/>
-              <w:t>［ ］可</w:t>
             </w:r>
           </w:p>
         </w:tc>
@@ -1811,7 +2203,7 @@
       <w:tr>
         <w:tc>
           <w:tcPr>
-            <w:tcW w:type="dxa" w:w="936"/>
+            <w:tcW w:type="dxa" w:w="1152"/>
             <w:vAlign w:val="center"/>
             <w:tcMar>
               <w:top w:w="50" w:type="dxa"/>
@@ -1834,7 +2226,7 @@
                 <w:color w:val="1E293B"/>
                 <w:sz w:val="17"/>
               </w:rPr>
-              <w:t>Day 09</w:t>
+              <w:t>Day 08</w:t>
             </w:r>
           </w:p>
         </w:tc>
@@ -1863,13 +2255,13 @@
                 <w:color w:val="1E293B"/>
                 <w:sz w:val="17"/>
               </w:rPr>
-              <w:t>10/15 (四)</w:t>
+              <w:t>10/14 (三)</w:t>
             </w:r>
           </w:p>
         </w:tc>
         <w:tc>
           <w:tcPr>
-            <w:tcW w:type="dxa" w:w="1728"/>
+            <w:tcW w:type="dxa" w:w="936"/>
             <w:vAlign w:val="center"/>
             <w:tcMar>
               <w:top w:w="50" w:type="dxa"/>
@@ -1892,13 +2284,13 @@
                 <w:color w:val="1E293B"/>
                 <w:sz w:val="17"/>
               </w:rPr>
-              <w:t>形容詞延展與抒情語調</w:t>
+              <w:t>在校集訓</w:t>
             </w:r>
           </w:p>
         </w:tc>
         <w:tc>
           <w:tcPr>
-            <w:tcW w:type="dxa" w:w="3456"/>
+            <w:tcW w:type="dxa" w:w="1872"/>
             <w:vAlign w:val="center"/>
             <w:tcMar>
               <w:top w:w="50" w:type="dxa"/>
@@ -1921,15 +2313,13 @@
                 <w:color w:val="1E293B"/>
                 <w:sz w:val="17"/>
               </w:rPr>
-              <w:t>【早修】抒情語調訓練：「絲綢般柔和而神祕的光澤」、「美麗的弧線」。聲音延展拉長（~），如絲綢般平滑柔潤。</w:t>
-              <w:br/>
-              <w:t>【午休】指導氣息支撐，避免拖音變成無病呻吟，要求柔而不虛、亮而不噪。</w:t>
+              <w:t>第四段奇蹟爆發：對比驚嘆語氣...</w:t>
             </w:r>
           </w:p>
         </w:tc>
         <w:tc>
           <w:tcPr>
-            <w:tcW w:type="dxa" w:w="2448"/>
+            <w:tcW w:type="dxa" w:w="3168"/>
             <w:vAlign w:val="center"/>
             <w:tcMar>
               <w:top w:w="50" w:type="dxa"/>
@@ -1952,7 +2342,36 @@
                 <w:color w:val="1E293B"/>
                 <w:sz w:val="17"/>
               </w:rPr>
-              <w:t>形容詞描繪細緻入微，聲音圓潤飽滿，富有藝術感染力。</w:t>
+              <w:t>指導第四段節奏突變：「奇怪的事終於發生了！」語調拔高、速度略快，表現出震驚與奇蹟感。隨後「藍得像藍天一般」語氣轉為無限讚嘆。</w:t>
+            </w:r>
+          </w:p>
+        </w:tc>
+        <w:tc>
+          <w:tcPr>
+            <w:tcW w:type="dxa" w:w="2160"/>
+            <w:vAlign w:val="center"/>
+            <w:tcMar>
+              <w:top w:w="50" w:type="dxa"/>
+              <w:bottom w:w="50" w:type="dxa"/>
+              <w:left w:w="50" w:type="dxa"/>
+              <w:right w:w="50" w:type="dxa"/>
+            </w:tcMar>
+            <w:shd w:fill="F8FAFC"/>
+          </w:tcPr>
+          <w:p>
+            <w:pPr>
+              <w:spacing w:before="0" w:after="0"/>
+              <w:jc w:val="left"/>
+            </w:pPr>
+            <w:r>
+              <w:rPr>
+                <w:rFonts w:ascii="微軟正黑體" w:hAnsi="微軟正黑體" w:eastAsia="微軟正黑體"/>
+                <w:b w:val="0"/>
+                <w:i w:val="0"/>
+                <w:color w:val="1E293B"/>
+                <w:sz w:val="17"/>
+              </w:rPr>
+              <w:t>語調起伏鮮明，對比強烈，能精準展現驚喜與讚嘆之情。</w:t>
             </w:r>
           </w:p>
         </w:tc>
@@ -1984,8 +2403,6 @@
               <w:t>［ ］優</w:t>
               <w:br/>
               <w:t>［ ］良</w:t>
-              <w:br/>
-              <w:t>［ ］可</w:t>
             </w:r>
           </w:p>
         </w:tc>
@@ -1993,7 +2410,7 @@
       <w:tr>
         <w:tc>
           <w:tcPr>
-            <w:tcW w:type="dxa" w:w="936"/>
+            <w:tcW w:type="dxa" w:w="1152"/>
             <w:vAlign w:val="center"/>
             <w:tcMar>
               <w:top w:w="50" w:type="dxa"/>
@@ -2015,7 +2432,7 @@
                 <w:color w:val="1E293B"/>
                 <w:sz w:val="17"/>
               </w:rPr>
-              <w:t>Day 10</w:t>
+              <w:t>Day 09</w:t>
             </w:r>
           </w:p>
         </w:tc>
@@ -2043,13 +2460,13 @@
                 <w:color w:val="1E293B"/>
                 <w:sz w:val="17"/>
               </w:rPr>
-              <w:t>10/16 (五)</w:t>
+              <w:t>10/15 (四)</w:t>
             </w:r>
           </w:p>
         </w:tc>
         <w:tc>
           <w:tcPr>
-            <w:tcW w:type="dxa" w:w="1728"/>
+            <w:tcW w:type="dxa" w:w="936"/>
             <w:vAlign w:val="center"/>
             <w:tcMar>
               <w:top w:w="50" w:type="dxa"/>
@@ -2071,13 +2488,13 @@
                 <w:color w:val="1E293B"/>
                 <w:sz w:val="17"/>
               </w:rPr>
-              <w:t>第二段整合朗讀與第 2 週驗收</w:t>
+              <w:t>在校集訓</w:t>
             </w:r>
           </w:p>
         </w:tc>
         <w:tc>
           <w:tcPr>
-            <w:tcW w:type="dxa" w:w="3456"/>
+            <w:tcW w:type="dxa" w:w="1872"/>
             <w:vAlign w:val="center"/>
             <w:tcMar>
               <w:top w:w="50" w:type="dxa"/>
@@ -2099,15 +2516,13 @@
                 <w:color w:val="1E293B"/>
                 <w:sz w:val="17"/>
               </w:rPr>
-              <w:t>【早修】第 2 週段落整合驗收：連貫朗讀第一、二段（約 260 字）。檢視前兩段由「靜謐」到「靈動」的情感層次遞進。</w:t>
-              <w:br/>
-              <w:t>【午休】使用手機為學生錄音，播放回聽，針對發音生硬或轉折突兀處進行一對一微調。</w:t>
+              <w:t>第五段生字與對比：一飛沖天 ...</w:t>
             </w:r>
           </w:p>
         </w:tc>
         <w:tc>
           <w:tcPr>
-            <w:tcW w:type="dxa" w:w="2448"/>
+            <w:tcW w:type="dxa" w:w="3168"/>
             <w:vAlign w:val="center"/>
             <w:tcMar>
               <w:top w:w="50" w:type="dxa"/>
@@ -2129,7 +2544,35 @@
                 <w:color w:val="1E293B"/>
                 <w:sz w:val="17"/>
               </w:rPr>
-              <w:t>第一、二段銜接自然，色彩明暗對比強烈，字音準確率達 100%，耗時約 1 分 45 秒。</w:t>
+              <w:t>第五段生字：誕(ㄉㄢˋ)生、一朶(ㄉㄨㄛˇ)花、一飛沖(ㄔㄨㄥ)天。白蝴蝶「飛下土地，吸食腐木」的沉悶，與藍蝴蝶「一飛沖天，在藍天下飛舞」的歡暢對比。</w:t>
+            </w:r>
+          </w:p>
+        </w:tc>
+        <w:tc>
+          <w:tcPr>
+            <w:tcW w:type="dxa" w:w="2160"/>
+            <w:vAlign w:val="center"/>
+            <w:tcMar>
+              <w:top w:w="50" w:type="dxa"/>
+              <w:bottom w:w="50" w:type="dxa"/>
+              <w:left w:w="50" w:type="dxa"/>
+              <w:right w:w="50" w:type="dxa"/>
+            </w:tcMar>
+          </w:tcPr>
+          <w:p>
+            <w:pPr>
+              <w:spacing w:before="0" w:after="0"/>
+              <w:jc w:val="left"/>
+            </w:pPr>
+            <w:r>
+              <w:rPr>
+                <w:rFonts w:ascii="微軟正黑體" w:hAnsi="微軟正黑體" w:eastAsia="微軟正黑體"/>
+                <w:b w:val="0"/>
+                <w:i w:val="0"/>
+                <w:color w:val="1E293B"/>
+                <w:sz w:val="17"/>
+              </w:rPr>
+              <w:t>音色明亮開闊，「一飛沖天」充滿動態美，疑問句熱情生動。</w:t>
             </w:r>
           </w:p>
         </w:tc>
@@ -2160,8 +2603,6 @@
               <w:t>［ ］優</w:t>
               <w:br/>
               <w:t>［ ］良</w:t>
-              <w:br/>
-              <w:t>［ ］可</w:t>
             </w:r>
           </w:p>
         </w:tc>
@@ -2169,7 +2610,414 @@
       <w:tr>
         <w:tc>
           <w:tcPr>
+            <w:tcW w:type="dxa" w:w="1152"/>
+            <w:vAlign w:val="center"/>
+            <w:tcMar>
+              <w:top w:w="50" w:type="dxa"/>
+              <w:bottom w:w="50" w:type="dxa"/>
+              <w:left w:w="50" w:type="dxa"/>
+              <w:right w:w="50" w:type="dxa"/>
+            </w:tcMar>
+            <w:shd w:fill="F8FAFC"/>
+          </w:tcPr>
+          <w:p>
+            <w:pPr>
+              <w:spacing w:before="0" w:after="0"/>
+              <w:jc w:val="center"/>
+            </w:pPr>
+            <w:r>
+              <w:rPr>
+                <w:rFonts w:ascii="微軟正黑體" w:hAnsi="微軟正黑體" w:eastAsia="微軟正黑體"/>
+                <w:b/>
+                <w:i w:val="0"/>
+                <w:color w:val="1E293B"/>
+                <w:sz w:val="17"/>
+              </w:rPr>
+              <w:t>Day 10</w:t>
+            </w:r>
+          </w:p>
+        </w:tc>
+        <w:tc>
+          <w:tcPr>
+            <w:tcW w:type="dxa" w:w="1224"/>
+            <w:vAlign w:val="center"/>
+            <w:tcMar>
+              <w:top w:w="50" w:type="dxa"/>
+              <w:bottom w:w="50" w:type="dxa"/>
+              <w:left w:w="50" w:type="dxa"/>
+              <w:right w:w="50" w:type="dxa"/>
+            </w:tcMar>
+            <w:shd w:fill="F8FAFC"/>
+          </w:tcPr>
+          <w:p>
+            <w:pPr>
+              <w:spacing w:before="0" w:after="0"/>
+              <w:jc w:val="left"/>
+            </w:pPr>
+            <w:r>
+              <w:rPr>
+                <w:rFonts w:ascii="微軟正黑體" w:hAnsi="微軟正黑體" w:eastAsia="微軟正黑體"/>
+                <w:b w:val="0"/>
+                <w:i w:val="0"/>
+                <w:color w:val="1E293B"/>
+                <w:sz w:val="17"/>
+              </w:rPr>
+              <w:t>10/16 (五)</w:t>
+            </w:r>
+          </w:p>
+        </w:tc>
+        <w:tc>
+          <w:tcPr>
             <w:tcW w:type="dxa" w:w="936"/>
+            <w:vAlign w:val="center"/>
+            <w:tcMar>
+              <w:top w:w="50" w:type="dxa"/>
+              <w:bottom w:w="50" w:type="dxa"/>
+              <w:left w:w="50" w:type="dxa"/>
+              <w:right w:w="50" w:type="dxa"/>
+            </w:tcMar>
+            <w:shd w:fill="F8FAFC"/>
+          </w:tcPr>
+          <w:p>
+            <w:pPr>
+              <w:spacing w:before="0" w:after="0"/>
+              <w:jc w:val="left"/>
+            </w:pPr>
+            <w:r>
+              <w:rPr>
+                <w:rFonts w:ascii="微軟正黑體" w:hAnsi="微軟正黑體" w:eastAsia="微軟正黑體"/>
+                <w:b w:val="0"/>
+                <w:i w:val="0"/>
+                <w:color w:val="1E293B"/>
+                <w:sz w:val="17"/>
+              </w:rPr>
+              <w:t>在校集訓</w:t>
+            </w:r>
+          </w:p>
+        </w:tc>
+        <w:tc>
+          <w:tcPr>
+            <w:tcW w:type="dxa" w:w="1872"/>
+            <w:vAlign w:val="center"/>
+            <w:tcMar>
+              <w:top w:w="50" w:type="dxa"/>
+              <w:bottom w:w="50" w:type="dxa"/>
+              <w:left w:w="50" w:type="dxa"/>
+              <w:right w:w="50" w:type="dxa"/>
+            </w:tcMar>
+            <w:shd w:fill="F8FAFC"/>
+          </w:tcPr>
+          <w:p>
+            <w:pPr>
+              <w:spacing w:before="0" w:after="0"/>
+              <w:jc w:val="left"/>
+            </w:pPr>
+            <w:r>
+              <w:rPr>
+                <w:rFonts w:ascii="微軟正黑體" w:hAnsi="微軟正黑體" w:eastAsia="微軟正黑體"/>
+                <w:b w:val="0"/>
+                <w:i w:val="0"/>
+                <w:color w:val="1E293B"/>
+                <w:sz w:val="17"/>
+              </w:rPr>
+              <w:t>第 1 至 5 段前段整合貫...</w:t>
+            </w:r>
+          </w:p>
+        </w:tc>
+        <w:tc>
+          <w:tcPr>
+            <w:tcW w:type="dxa" w:w="3168"/>
+            <w:vAlign w:val="center"/>
+            <w:tcMar>
+              <w:top w:w="50" w:type="dxa"/>
+              <w:bottom w:w="50" w:type="dxa"/>
+              <w:left w:w="50" w:type="dxa"/>
+              <w:right w:w="50" w:type="dxa"/>
+            </w:tcMar>
+            <w:shd w:fill="F8FAFC"/>
+          </w:tcPr>
+          <w:p>
+            <w:pPr>
+              <w:spacing w:before="0" w:after="0"/>
+              <w:jc w:val="left"/>
+            </w:pPr>
+            <w:r>
+              <w:rPr>
+                <w:rFonts w:ascii="微軟正黑體" w:hAnsi="微軟正黑體" w:eastAsia="微軟正黑體"/>
+                <w:b w:val="0"/>
+                <w:i w:val="0"/>
+                <w:color w:val="1E293B"/>
+                <w:sz w:val="17"/>
+              </w:rPr>
+              <w:t>前五段貫通演練：從山谷起步、毛毛蟲渴望、深深冥想、奇蹟長出藍翅膀，到一飛沖天。執行第 2 週驗收。</w:t>
+            </w:r>
+          </w:p>
+        </w:tc>
+        <w:tc>
+          <w:tcPr>
+            <w:tcW w:type="dxa" w:w="2160"/>
+            <w:vAlign w:val="center"/>
+            <w:tcMar>
+              <w:top w:w="50" w:type="dxa"/>
+              <w:bottom w:w="50" w:type="dxa"/>
+              <w:left w:w="50" w:type="dxa"/>
+              <w:right w:w="50" w:type="dxa"/>
+            </w:tcMar>
+            <w:shd w:fill="F8FAFC"/>
+          </w:tcPr>
+          <w:p>
+            <w:pPr>
+              <w:spacing w:before="0" w:after="0"/>
+              <w:jc w:val="left"/>
+            </w:pPr>
+            <w:r>
+              <w:rPr>
+                <w:rFonts w:ascii="微軟正黑體" w:hAnsi="微軟正黑體" w:eastAsia="微軟正黑體"/>
+                <w:b w:val="0"/>
+                <w:i w:val="0"/>
+                <w:color w:val="1E293B"/>
+                <w:sz w:val="17"/>
+              </w:rPr>
+              <w:t>前五段在 55-65 秒內完整流暢朗讀，段落情感層次分明，無任何錯字卡殼。</w:t>
+            </w:r>
+          </w:p>
+        </w:tc>
+        <w:tc>
+          <w:tcPr>
+            <w:tcW w:type="dxa" w:w="1008"/>
+            <w:vAlign w:val="center"/>
+            <w:tcMar>
+              <w:top w:w="50" w:type="dxa"/>
+              <w:bottom w:w="50" w:type="dxa"/>
+              <w:left w:w="50" w:type="dxa"/>
+              <w:right w:w="50" w:type="dxa"/>
+            </w:tcMar>
+            <w:shd w:fill="F8FAFC"/>
+          </w:tcPr>
+          <w:p>
+            <w:pPr>
+              <w:spacing w:before="0" w:after="0"/>
+              <w:jc w:val="left"/>
+            </w:pPr>
+            <w:r>
+              <w:rPr>
+                <w:rFonts w:ascii="微軟正黑體" w:hAnsi="微軟正黑體" w:eastAsia="微軟正黑體"/>
+                <w:b w:val="0"/>
+                <w:i w:val="0"/>
+                <w:color w:val="1E293B"/>
+                <w:sz w:val="17"/>
+              </w:rPr>
+              <w:t>［ ］優</w:t>
+              <w:br/>
+              <w:t>［ ］良</w:t>
+            </w:r>
+          </w:p>
+        </w:tc>
+      </w:tr>
+      <w:tr>
+        <w:tc>
+          <w:tcPr>
+            <w:tcW w:type="dxa" w:w="1152"/>
+            <w:vAlign w:val="center"/>
+            <w:tcMar>
+              <w:top w:w="50" w:type="dxa"/>
+              <w:bottom w:w="50" w:type="dxa"/>
+              <w:left w:w="50" w:type="dxa"/>
+              <w:right w:w="50" w:type="dxa"/>
+            </w:tcMar>
+          </w:tcPr>
+          <w:p>
+            <w:pPr>
+              <w:spacing w:before="0" w:after="0"/>
+              <w:jc w:val="center"/>
+            </w:pPr>
+            <w:r>
+              <w:rPr>
+                <w:rFonts w:ascii="微軟正黑體" w:hAnsi="微軟正黑體" w:eastAsia="微軟正黑體"/>
+                <w:b/>
+                <w:i w:val="0"/>
+                <w:color w:val="1E293B"/>
+                <w:sz w:val="17"/>
+              </w:rPr>
+              <w:t>週末假日二</w:t>
+            </w:r>
+          </w:p>
+        </w:tc>
+        <w:tc>
+          <w:tcPr>
+            <w:tcW w:type="dxa" w:w="1224"/>
+            <w:vAlign w:val="center"/>
+            <w:tcMar>
+              <w:top w:w="50" w:type="dxa"/>
+              <w:bottom w:w="50" w:type="dxa"/>
+              <w:left w:w="50" w:type="dxa"/>
+              <w:right w:w="50" w:type="dxa"/>
+            </w:tcMar>
+          </w:tcPr>
+          <w:p>
+            <w:pPr>
+              <w:spacing w:before="0" w:after="0"/>
+              <w:jc w:val="left"/>
+            </w:pPr>
+            <w:r>
+              <w:rPr>
+                <w:rFonts w:ascii="微軟正黑體" w:hAnsi="微軟正黑體" w:eastAsia="微軟正黑體"/>
+                <w:b w:val="0"/>
+                <w:i w:val="0"/>
+                <w:color w:val="1E293B"/>
+                <w:sz w:val="17"/>
+              </w:rPr>
+              <w:t>10/17 (六) ~ 10/18 (日)</w:t>
+            </w:r>
+          </w:p>
+        </w:tc>
+        <w:tc>
+          <w:tcPr>
+            <w:tcW w:type="dxa" w:w="936"/>
+            <w:vAlign w:val="center"/>
+            <w:tcMar>
+              <w:top w:w="50" w:type="dxa"/>
+              <w:bottom w:w="50" w:type="dxa"/>
+              <w:left w:w="50" w:type="dxa"/>
+              <w:right w:w="50" w:type="dxa"/>
+            </w:tcMar>
+          </w:tcPr>
+          <w:p>
+            <w:pPr>
+              <w:spacing w:before="0" w:after="0"/>
+              <w:jc w:val="left"/>
+            </w:pPr>
+            <w:r>
+              <w:rPr>
+                <w:rFonts w:ascii="微軟正黑體" w:hAnsi="微軟正黑體" w:eastAsia="微軟正黑體"/>
+                <w:b w:val="0"/>
+                <w:i w:val="0"/>
+                <w:color w:val="1E293B"/>
+                <w:sz w:val="17"/>
+              </w:rPr>
+              <w:t>假日自學增量</w:t>
+            </w:r>
+          </w:p>
+        </w:tc>
+        <w:tc>
+          <w:tcPr>
+            <w:tcW w:type="dxa" w:w="1872"/>
+            <w:vAlign w:val="center"/>
+            <w:tcMar>
+              <w:top w:w="50" w:type="dxa"/>
+              <w:bottom w:w="50" w:type="dxa"/>
+              <w:left w:w="50" w:type="dxa"/>
+              <w:right w:w="50" w:type="dxa"/>
+            </w:tcMar>
+          </w:tcPr>
+          <w:p>
+            <w:pPr>
+              <w:spacing w:before="0" w:after="0"/>
+              <w:jc w:val="left"/>
+            </w:pPr>
+            <w:r>
+              <w:rPr>
+                <w:rFonts w:ascii="微軟正黑體" w:hAnsi="微軟正黑體" w:eastAsia="微軟正黑體"/>
+                <w:b w:val="0"/>
+                <w:i w:val="0"/>
+                <w:color w:val="1E293B"/>
+                <w:sz w:val="17"/>
+              </w:rPr>
+              <w:t>【假日自主自學與朗讀增量 B...</w:t>
+            </w:r>
+          </w:p>
+        </w:tc>
+        <w:tc>
+          <w:tcPr>
+            <w:tcW w:type="dxa" w:w="3168"/>
+            <w:vAlign w:val="center"/>
+            <w:tcMar>
+              <w:top w:w="50" w:type="dxa"/>
+              <w:bottom w:w="50" w:type="dxa"/>
+              <w:left w:w="50" w:type="dxa"/>
+              <w:right w:w="50" w:type="dxa"/>
+            </w:tcMar>
+          </w:tcPr>
+          <w:p>
+            <w:pPr>
+              <w:spacing w:before="0" w:after="0"/>
+              <w:jc w:val="left"/>
+            </w:pPr>
+            <w:r>
+              <w:rPr>
+                <w:rFonts w:ascii="微軟正黑體" w:hAnsi="微軟正黑體" w:eastAsia="微軟正黑體"/>
+                <w:b w:val="0"/>
+                <w:i w:val="0"/>
+                <w:color w:val="1E293B"/>
+                <w:sz w:val="17"/>
+              </w:rPr>
+              <w:t>【週末自學指引】週末自學增量任務：1. 前五段計時朗讀 10 遍；2. 鏡前抬頭訓練（每段至少抬頭 2 次，雙眼平視鏡中自己）；3. 家長錄音打卡。</w:t>
+            </w:r>
+          </w:p>
+        </w:tc>
+        <w:tc>
+          <w:tcPr>
+            <w:tcW w:type="dxa" w:w="2160"/>
+            <w:vAlign w:val="center"/>
+            <w:tcMar>
+              <w:top w:w="50" w:type="dxa"/>
+              <w:bottom w:w="50" w:type="dxa"/>
+              <w:left w:w="50" w:type="dxa"/>
+              <w:right w:w="50" w:type="dxa"/>
+            </w:tcMar>
+          </w:tcPr>
+          <w:p>
+            <w:pPr>
+              <w:spacing w:before="0" w:after="0"/>
+              <w:jc w:val="left"/>
+            </w:pPr>
+            <w:r>
+              <w:rPr>
+                <w:rFonts w:ascii="微軟正黑體" w:hAnsi="微軟正黑體" w:eastAsia="微軟正黑體"/>
+                <w:b w:val="0"/>
+                <w:i w:val="0"/>
+                <w:color w:val="1E293B"/>
+                <w:sz w:val="17"/>
+              </w:rPr>
+              <w:t>【特優】時間 58-62 秒，抬頭 8 次以上且目光有神；【優等】時間合格但眼神飄忽；【尚可】超過 70 秒或有卡頓。</w:t>
+            </w:r>
+          </w:p>
+        </w:tc>
+        <w:tc>
+          <w:tcPr>
+            <w:tcW w:type="dxa" w:w="1008"/>
+            <w:vAlign w:val="center"/>
+            <w:tcMar>
+              <w:top w:w="50" w:type="dxa"/>
+              <w:bottom w:w="50" w:type="dxa"/>
+              <w:left w:w="50" w:type="dxa"/>
+              <w:right w:w="50" w:type="dxa"/>
+            </w:tcMar>
+          </w:tcPr>
+          <w:p>
+            <w:pPr>
+              <w:spacing w:before="0" w:after="0"/>
+              <w:jc w:val="left"/>
+            </w:pPr>
+            <w:r>
+              <w:rPr>
+                <w:rFonts w:ascii="微軟正黑體" w:hAnsi="微軟正黑體" w:eastAsia="微軟正黑體"/>
+                <w:b w:val="0"/>
+                <w:i w:val="0"/>
+                <w:color w:val="1E293B"/>
+                <w:sz w:val="17"/>
+              </w:rPr>
+              <w:t>［ ］優</w:t>
+              <w:br/>
+              <w:t>［ ］良</w:t>
+            </w:r>
+          </w:p>
+        </w:tc>
+      </w:tr>
+      <w:tr>
+        <w:tc>
+          <w:tcPr>
+            <w:tcW w:type="dxa" w:w="1152"/>
             <w:vAlign w:val="center"/>
             <w:tcMar>
               <w:top w:w="50" w:type="dxa"/>
@@ -2227,7 +3075,7 @@
         </w:tc>
         <w:tc>
           <w:tcPr>
-            <w:tcW w:type="dxa" w:w="1728"/>
+            <w:tcW w:type="dxa" w:w="936"/>
             <w:vAlign w:val="center"/>
             <w:tcMar>
               <w:top w:w="50" w:type="dxa"/>
@@ -2250,13 +3098,13 @@
                 <w:color w:val="1E293B"/>
                 <w:sz w:val="17"/>
               </w:rPr>
-              <w:t>第三段生字正音：哲思與感悟</w:t>
+              <w:t>在校集訓</w:t>
             </w:r>
           </w:p>
         </w:tc>
         <w:tc>
           <w:tcPr>
-            <w:tcW w:type="dxa" w:w="3456"/>
+            <w:tcW w:type="dxa" w:w="1872"/>
             <w:vAlign w:val="center"/>
             <w:tcMar>
               <w:top w:w="50" w:type="dxa"/>
@@ -2279,15 +3127,13 @@
                 <w:color w:val="1E293B"/>
                 <w:sz w:val="17"/>
               </w:rPr>
-              <w:t>【早修】第三段生字正音：浩瀚(ㄏㄠˋ ㄏㄢˋ)、遼闊(ㄌㄧㄠˊ ㄎㄨㄛˋ)、傾盡(ㄑㄧㄥ ㄐㄧㄣˋ)、純粹(ㄔㄨㄣˊ ㄘㄨㄟˋ)、綻放(ㄓㄢˋ ㄈㄤˋ)。</w:t>
-              <w:br/>
-              <w:t>【午休】重點校正「綻(ㄓㄢˋ)放」，嚴禁讀成ㄉㄧㄥˋ；「純粹(ㄘㄨㄟˋ)」平舌音清脆有力。</w:t>
+              <w:t>第六、七段生字：吸吮(ㄕㄨㄣ...</w:t>
             </w:r>
           </w:p>
         </w:tc>
         <w:tc>
           <w:tcPr>
-            <w:tcW w:type="dxa" w:w="2448"/>
+            <w:tcW w:type="dxa" w:w="3168"/>
             <w:vAlign w:val="center"/>
             <w:tcMar>
               <w:top w:w="50" w:type="dxa"/>
@@ -2310,7 +3156,36 @@
                 <w:color w:val="1E293B"/>
                 <w:sz w:val="17"/>
               </w:rPr>
-              <w:t>第三段生字發音完全正確，咬字沉穩厚重，展現哲學思考之厚度。</w:t>
+              <w:t>難字專題：吸吮(ㄕㄨㄣˇ，非ㄩㄣˇ，特別重點校正！)、芬(ㄈㄣ)芳(ㄈㄤ)、聚(ㄐㄩˋ)居。白蝴蝶「把藍天夢成了翅膀」的震撼與美麗想像。</w:t>
+            </w:r>
+          </w:p>
+        </w:tc>
+        <w:tc>
+          <w:tcPr>
+            <w:tcW w:type="dxa" w:w="2160"/>
+            <w:vAlign w:val="center"/>
+            <w:tcMar>
+              <w:top w:w="50" w:type="dxa"/>
+              <w:bottom w:w="50" w:type="dxa"/>
+              <w:left w:w="50" w:type="dxa"/>
+              <w:right w:w="50" w:type="dxa"/>
+            </w:tcMar>
+            <w:shd w:fill="F8FAFC"/>
+          </w:tcPr>
+          <w:p>
+            <w:pPr>
+              <w:spacing w:before="0" w:after="0"/>
+              <w:jc w:val="left"/>
+            </w:pPr>
+            <w:r>
+              <w:rPr>
+                <w:rFonts w:ascii="微軟正黑體" w:hAnsi="微軟正黑體" w:eastAsia="微軟正黑體"/>
+                <w:b w:val="0"/>
+                <w:i w:val="0"/>
+                <w:color w:val="1E293B"/>
+                <w:sz w:val="17"/>
+              </w:rPr>
+              <w:t>「吸吮」讀音 100% 正確，第七段結尾語氣充滿詩意回味。</w:t>
             </w:r>
           </w:p>
         </w:tc>
@@ -2342,8 +3217,6 @@
               <w:t>［ ］優</w:t>
               <w:br/>
               <w:t>［ ］良</w:t>
-              <w:br/>
-              <w:t>［ ］可</w:t>
             </w:r>
           </w:p>
         </w:tc>
@@ -2351,7 +3224,7 @@
       <w:tr>
         <w:tc>
           <w:tcPr>
-            <w:tcW w:type="dxa" w:w="936"/>
+            <w:tcW w:type="dxa" w:w="1152"/>
             <w:vAlign w:val="center"/>
             <w:tcMar>
               <w:top w:w="50" w:type="dxa"/>
@@ -2407,7 +3280,7 @@
         </w:tc>
         <w:tc>
           <w:tcPr>
-            <w:tcW w:type="dxa" w:w="1728"/>
+            <w:tcW w:type="dxa" w:w="936"/>
             <w:vAlign w:val="center"/>
             <w:tcMar>
               <w:top w:w="50" w:type="dxa"/>
@@ -2429,13 +3302,13 @@
                 <w:color w:val="1E293B"/>
                 <w:sz w:val="17"/>
               </w:rPr>
-              <w:t>胸腔共鳴與聲音厚度訓練</w:t>
+              <w:t>在校集訓</w:t>
             </w:r>
           </w:p>
         </w:tc>
         <w:tc>
           <w:tcPr>
-            <w:tcW w:type="dxa" w:w="3456"/>
+            <w:tcW w:type="dxa" w:w="1872"/>
             <w:vAlign w:val="center"/>
             <w:tcMar>
               <w:top w:w="50" w:type="dxa"/>
@@ -2457,15 +3330,13 @@
                 <w:color w:val="1E293B"/>
                 <w:sz w:val="17"/>
               </w:rPr>
-              <w:t>【早修】共鳴腔體訓練：由前段的頭腔高音轉為「胸腔共鳴」，將氣息沉入丹田，發出厚實、深沉、溫暖的聲音，表現作者內心的震撼與領悟。</w:t>
-              <w:br/>
-              <w:t>【午休】引導學生手摸胸口感受震動，朗讀「看著這隻在風中悠然舞動的藍蝴蝶，我的心中湧起莫名的感動……」。</w:t>
+              <w:t>第八、九段結尾高潮：藍之又藍...</w:t>
             </w:r>
           </w:p>
         </w:tc>
         <w:tc>
           <w:tcPr>
-            <w:tcW w:type="dxa" w:w="2448"/>
+            <w:tcW w:type="dxa" w:w="3168"/>
             <w:vAlign w:val="center"/>
             <w:tcMar>
               <w:top w:w="50" w:type="dxa"/>
@@ -2487,7 +3358,35 @@
                 <w:color w:val="1E293B"/>
                 <w:sz w:val="17"/>
               </w:rPr>
-              <w:t>聲音富有磁性與厚度，感情真摯深沉，不浮躁、不輕飄。</w:t>
+              <w:t>第八、九段結尾聲情雕琢：總結句「它們藍之又藍，藍得比它們的祖先—第一隻藍蝴蝶—還要藍；它們自由自在，比第一隻藍蝴蝶飛得更高更遠。」語氣步步攀升，字字鏗鏘，氣勢恢宏！</w:t>
+            </w:r>
+          </w:p>
+        </w:tc>
+        <w:tc>
+          <w:tcPr>
+            <w:tcW w:type="dxa" w:w="2160"/>
+            <w:vAlign w:val="center"/>
+            <w:tcMar>
+              <w:top w:w="50" w:type="dxa"/>
+              <w:bottom w:w="50" w:type="dxa"/>
+              <w:left w:w="50" w:type="dxa"/>
+              <w:right w:w="50" w:type="dxa"/>
+            </w:tcMar>
+          </w:tcPr>
+          <w:p>
+            <w:pPr>
+              <w:spacing w:before="0" w:after="0"/>
+              <w:jc w:val="left"/>
+            </w:pPr>
+            <w:r>
+              <w:rPr>
+                <w:rFonts w:ascii="微軟正黑體" w:hAnsi="微軟正黑體" w:eastAsia="微軟正黑體"/>
+                <w:b w:val="0"/>
+                <w:i w:val="0"/>
+                <w:color w:val="1E293B"/>
+                <w:sz w:val="17"/>
+              </w:rPr>
+              <w:t>結尾氣勢昂揚，聲音結實飽滿，語調漸進上揚，餘音繞樑。</w:t>
             </w:r>
           </w:p>
         </w:tc>
@@ -2518,8 +3417,6 @@
               <w:t>［ ］優</w:t>
               <w:br/>
               <w:t>［ ］良</w:t>
-              <w:br/>
-              <w:t>［ ］可</w:t>
             </w:r>
           </w:p>
         </w:tc>
@@ -2527,7 +3424,7 @@
       <w:tr>
         <w:tc>
           <w:tcPr>
-            <w:tcW w:type="dxa" w:w="936"/>
+            <w:tcW w:type="dxa" w:w="1152"/>
             <w:vAlign w:val="center"/>
             <w:tcMar>
               <w:top w:w="50" w:type="dxa"/>
@@ -2585,7 +3482,7 @@
         </w:tc>
         <w:tc>
           <w:tcPr>
-            <w:tcW w:type="dxa" w:w="1728"/>
+            <w:tcW w:type="dxa" w:w="936"/>
             <w:vAlign w:val="center"/>
             <w:tcMar>
               <w:top w:w="50" w:type="dxa"/>
@@ -2608,13 +3505,13 @@
                 <w:color w:val="1E293B"/>
                 <w:sz w:val="17"/>
               </w:rPr>
-              <w:t>對比句的語氣分寸拿捏</w:t>
+              <w:t>在校集訓</w:t>
             </w:r>
           </w:p>
         </w:tc>
         <w:tc>
           <w:tcPr>
-            <w:tcW w:type="dxa" w:w="3456"/>
+            <w:tcW w:type="dxa" w:w="1872"/>
             <w:vAlign w:val="center"/>
             <w:tcMar>
               <w:top w:w="50" w:type="dxa"/>
@@ -2637,15 +3534,13 @@
                 <w:color w:val="1E293B"/>
                 <w:sz w:val="17"/>
               </w:rPr>
-              <w:t>【早修】對比句處理：「生命的旅程或許短暫（語氣收斂低沉），但它卻傾盡全力（語氣堅定高昂），將生命中最燦爛、最純粹的美麗……綻放在這片天地之間。」</w:t>
-              <w:br/>
-              <w:t>【午休】示範「短暫」與「傾盡全力」之間的強烈情感張力，讓聽眾感受到小生命蘊含的大能量。</w:t>
+              <w:t>全篇九段無縫連貫與全真時間配...</w:t>
             </w:r>
           </w:p>
         </w:tc>
         <w:tc>
           <w:tcPr>
-            <w:tcW w:type="dxa" w:w="2448"/>
+            <w:tcW w:type="dxa" w:w="3168"/>
             <w:vAlign w:val="center"/>
             <w:tcMar>
               <w:top w:w="50" w:type="dxa"/>
@@ -2668,7 +3563,36 @@
                 <w:color w:val="1E293B"/>
                 <w:sz w:val="17"/>
               </w:rPr>
-              <w:t>強弱對比鮮明，能深刻表達出對生命的敬畏與讚美。</w:t>
+              <w:t>全篇 420 字整體配速控制：比賽限時 2 分鐘，理想朗讀完篇時間為 1 分 45 秒 至 1 分 55 秒。平均每分鐘 220 字左右，從容穩健，切忌狂奔，亦不可拖沓。</w:t>
+            </w:r>
+          </w:p>
+        </w:tc>
+        <w:tc>
+          <w:tcPr>
+            <w:tcW w:type="dxa" w:w="2160"/>
+            <w:vAlign w:val="center"/>
+            <w:tcMar>
+              <w:top w:w="50" w:type="dxa"/>
+              <w:bottom w:w="50" w:type="dxa"/>
+              <w:left w:w="50" w:type="dxa"/>
+              <w:right w:w="50" w:type="dxa"/>
+            </w:tcMar>
+            <w:shd w:fill="F8FAFC"/>
+          </w:tcPr>
+          <w:p>
+            <w:pPr>
+              <w:spacing w:before="0" w:after="0"/>
+              <w:jc w:val="left"/>
+            </w:pPr>
+            <w:r>
+              <w:rPr>
+                <w:rFonts w:ascii="微軟正黑體" w:hAnsi="微軟正黑體" w:eastAsia="微軟正黑體"/>
+                <w:b w:val="0"/>
+                <w:i w:val="0"/>
+                <w:color w:val="1E293B"/>
+                <w:sz w:val="17"/>
+              </w:rPr>
+              <w:t>全篇朗讀時間精確落在 1分45秒 至 1分55秒 區間內，節奏起伏得當。</w:t>
             </w:r>
           </w:p>
         </w:tc>
@@ -2700,8 +3624,6 @@
               <w:t>［ ］優</w:t>
               <w:br/>
               <w:t>［ ］良</w:t>
-              <w:br/>
-              <w:t>［ ］可</w:t>
             </w:r>
           </w:p>
         </w:tc>
@@ -2709,7 +3631,7 @@
       <w:tr>
         <w:tc>
           <w:tcPr>
-            <w:tcW w:type="dxa" w:w="936"/>
+            <w:tcW w:type="dxa" w:w="1152"/>
             <w:vAlign w:val="center"/>
             <w:tcMar>
               <w:top w:w="50" w:type="dxa"/>
@@ -2765,7 +3687,7 @@
         </w:tc>
         <w:tc>
           <w:tcPr>
-            <w:tcW w:type="dxa" w:w="1728"/>
+            <w:tcW w:type="dxa" w:w="936"/>
             <w:vAlign w:val="center"/>
             <w:tcMar>
               <w:top w:w="50" w:type="dxa"/>
@@ -2787,13 +3709,13 @@
                 <w:color w:val="1E293B"/>
                 <w:sz w:val="17"/>
               </w:rPr>
-              <w:t>全篇結尾句昇華與餘音繞樑</w:t>
+              <w:t>在校集訓</w:t>
             </w:r>
           </w:p>
         </w:tc>
         <w:tc>
           <w:tcPr>
-            <w:tcW w:type="dxa" w:w="3456"/>
+            <w:tcW w:type="dxa" w:w="1872"/>
             <w:vAlign w:val="center"/>
             <w:tcMar>
               <w:top w:w="50" w:type="dxa"/>
@@ -2815,15 +3737,13 @@
                 <w:color w:val="1E293B"/>
                 <w:sz w:val="17"/>
               </w:rPr>
-              <w:t>【早修】總結句處理：「生命的價值，不在於歲月的長短，而在於是否曾經用盡全身的力量，綻放出屬於自己的獨特光彩。」字字清晰、節奏漸慢、情感飽滿收尾。</w:t>
-              <w:br/>
-              <w:t>【午休】指導結尾收音時，目光堅定平視評審，讀完最後一個字後，保持微笑停留 2 秒再行致意。</w:t>
+              <w:t>眼神交流與「抬頭率」實戰突破...</w:t>
             </w:r>
           </w:p>
         </w:tc>
         <w:tc>
           <w:tcPr>
-            <w:tcW w:type="dxa" w:w="2448"/>
+            <w:tcW w:type="dxa" w:w="3168"/>
             <w:vAlign w:val="center"/>
             <w:tcMar>
               <w:top w:w="50" w:type="dxa"/>
@@ -2845,7 +3765,35 @@
                 <w:color w:val="1E293B"/>
                 <w:sz w:val="17"/>
               </w:rPr>
-              <w:t>結尾昇華有力，餘韻悠長，收音乾淨俐落，留下深刻的感動。</w:t>
+              <w:t>指導「黃金抬頭點」：在每個句號、驚嘆號或轉折處抬頭看向評審。全篇至少設置 10 處必抬頭標記（★）。示範目光平視、面帶微笑、眼神自信堅定。</w:t>
+            </w:r>
+          </w:p>
+        </w:tc>
+        <w:tc>
+          <w:tcPr>
+            <w:tcW w:type="dxa" w:w="2160"/>
+            <w:vAlign w:val="center"/>
+            <w:tcMar>
+              <w:top w:w="50" w:type="dxa"/>
+              <w:bottom w:w="50" w:type="dxa"/>
+              <w:left w:w="50" w:type="dxa"/>
+              <w:right w:w="50" w:type="dxa"/>
+            </w:tcMar>
+          </w:tcPr>
+          <w:p>
+            <w:pPr>
+              <w:spacing w:before="0" w:after="0"/>
+              <w:jc w:val="left"/>
+            </w:pPr>
+            <w:r>
+              <w:rPr>
+                <w:rFonts w:ascii="微軟正黑體" w:hAnsi="微軟正黑體" w:eastAsia="微軟正黑體"/>
+                <w:b w:val="0"/>
+                <w:i w:val="0"/>
+                <w:color w:val="1E293B"/>
+                <w:sz w:val="17"/>
+              </w:rPr>
+              <w:t>全篇抬頭次數達到 10 次以上，眼神堅定自信，與評審有良好心靈交流。</w:t>
             </w:r>
           </w:p>
         </w:tc>
@@ -2876,8 +3824,6 @@
               <w:t>［ ］優</w:t>
               <w:br/>
               <w:t>［ ］良</w:t>
-              <w:br/>
-              <w:t>［ ］可</w:t>
             </w:r>
           </w:p>
         </w:tc>
@@ -2885,7 +3831,7 @@
       <w:tr>
         <w:tc>
           <w:tcPr>
-            <w:tcW w:type="dxa" w:w="936"/>
+            <w:tcW w:type="dxa" w:w="1152"/>
             <w:vAlign w:val="center"/>
             <w:tcMar>
               <w:top w:w="50" w:type="dxa"/>
@@ -2943,7 +3889,7 @@
         </w:tc>
         <w:tc>
           <w:tcPr>
-            <w:tcW w:type="dxa" w:w="1728"/>
+            <w:tcW w:type="dxa" w:w="936"/>
             <w:vAlign w:val="center"/>
             <w:tcMar>
               <w:top w:w="50" w:type="dxa"/>
@@ -2966,13 +3912,13 @@
                 <w:color w:val="1E293B"/>
                 <w:sz w:val="17"/>
               </w:rPr>
-              <w:t>全篇三段貫通朗讀與第 3 週驗收</w:t>
+              <w:t>在校集訓</w:t>
             </w:r>
           </w:p>
         </w:tc>
         <w:tc>
           <w:tcPr>
-            <w:tcW w:type="dxa" w:w="3456"/>
+            <w:tcW w:type="dxa" w:w="1872"/>
             <w:vAlign w:val="center"/>
             <w:tcMar>
               <w:top w:w="50" w:type="dxa"/>
@@ -2995,15 +3941,13 @@
                 <w:color w:val="1E293B"/>
                 <w:sz w:val="17"/>
               </w:rPr>
-              <w:t>【早修】全篇大貫通：將起（靜謐山林）、承（藍蝶飛舞）、轉合（生命哲思）完整串聯。字數約 400 字，要求字音零失誤、情緒層次如行雲流水。</w:t>
-              <w:br/>
-              <w:t>【午休】計時檢核，掌握全篇耗時（理想區間：3 分 15 秒至 3 分 35 秒）。進行第 3 週全面驗收。</w:t>
+              <w:t>全篇整合朗讀與第 3 週總結...</w:t>
             </w:r>
           </w:p>
         </w:tc>
         <w:tc>
           <w:tcPr>
-            <w:tcW w:type="dxa" w:w="2448"/>
+            <w:tcW w:type="dxa" w:w="3168"/>
             <w:vAlign w:val="center"/>
             <w:tcMar>
               <w:top w:w="50" w:type="dxa"/>
@@ -3026,7 +3970,36 @@
                 <w:color w:val="1E293B"/>
                 <w:sz w:val="17"/>
               </w:rPr>
-              <w:t>全篇連貫無停頓卡詞，字音 100% 正確，情緒飽滿，時間控制在 3分15秒~3分35秒。</w:t>
+              <w:t>第 3 週綜合大驗收：完整模擬比賽情境。報號、報題、持稿、全篇朗讀、下台鞠躬。嚴格評定三個等第（特優、優等、尚可）。</w:t>
+            </w:r>
+          </w:p>
+        </w:tc>
+        <w:tc>
+          <w:tcPr>
+            <w:tcW w:type="dxa" w:w="2160"/>
+            <w:vAlign w:val="center"/>
+            <w:tcMar>
+              <w:top w:w="50" w:type="dxa"/>
+              <w:bottom w:w="50" w:type="dxa"/>
+              <w:left w:w="50" w:type="dxa"/>
+              <w:right w:w="50" w:type="dxa"/>
+            </w:tcMar>
+            <w:shd w:fill="F8FAFC"/>
+          </w:tcPr>
+          <w:p>
+            <w:pPr>
+              <w:spacing w:before="0" w:after="0"/>
+              <w:jc w:val="left"/>
+            </w:pPr>
+            <w:r>
+              <w:rPr>
+                <w:rFonts w:ascii="微軟正黑體" w:hAnsi="微軟正黑體" w:eastAsia="微軟正黑體"/>
+                <w:b w:val="0"/>
+                <w:i w:val="0"/>
+                <w:color w:val="1E293B"/>
+                <w:sz w:val="17"/>
+              </w:rPr>
+              <w:t>達到校內競賽特優水準：字音 0 瑕疵、聲情層次分明、抬頭自然大方、時間精準。</w:t>
             </w:r>
           </w:p>
         </w:tc>
@@ -3058,8 +4031,6 @@
               <w:t>［ ］優</w:t>
               <w:br/>
               <w:t>［ ］良</w:t>
-              <w:br/>
-              <w:t>［ ］可</w:t>
             </w:r>
           </w:p>
         </w:tc>
@@ -3067,7 +4038,7 @@
       <w:tr>
         <w:tc>
           <w:tcPr>
-            <w:tcW w:type="dxa" w:w="936"/>
+            <w:tcW w:type="dxa" w:w="1152"/>
             <w:vAlign w:val="center"/>
             <w:tcMar>
               <w:top w:w="50" w:type="dxa"/>
@@ -3089,7 +4060,7 @@
                 <w:color w:val="1E293B"/>
                 <w:sz w:val="17"/>
               </w:rPr>
-              <w:t>Day 16</w:t>
+              <w:t>週末假日三</w:t>
             </w:r>
           </w:p>
         </w:tc>
@@ -3117,13 +4088,13 @@
                 <w:color w:val="1E293B"/>
                 <w:sz w:val="17"/>
               </w:rPr>
-              <w:t>10/26 (一)</w:t>
+              <w:t>10/17 (六) ~ 10/18 (日)</w:t>
             </w:r>
           </w:p>
         </w:tc>
         <w:tc>
           <w:tcPr>
-            <w:tcW w:type="dxa" w:w="1728"/>
+            <w:tcW w:type="dxa" w:w="936"/>
             <w:vAlign w:val="center"/>
             <w:tcMar>
               <w:top w:w="50" w:type="dxa"/>
@@ -3145,13 +4116,13 @@
                 <w:color w:val="1E293B"/>
                 <w:sz w:val="17"/>
               </w:rPr>
-              <w:t>眼神交流與「抬頭率」提升訓練</w:t>
+              <w:t>假日自學增量</w:t>
             </w:r>
           </w:p>
         </w:tc>
         <w:tc>
           <w:tcPr>
-            <w:tcW w:type="dxa" w:w="3456"/>
+            <w:tcW w:type="dxa" w:w="1872"/>
             <w:vAlign w:val="center"/>
             <w:tcMar>
               <w:top w:w="50" w:type="dxa"/>
@@ -3173,15 +4144,13 @@
                 <w:color w:val="1E293B"/>
                 <w:sz w:val="17"/>
               </w:rPr>
-              <w:t>【早修】朗讀儀態進階：眼睛不可死盯稿紙！傳授「瞄一眼、看評審」心法。在每句換氣或句末處抬頭看向評判席，全篇抬頭率達到 30% 以上。</w:t>
-              <w:br/>
-              <w:t>【午休】導師坐在評審席位置，訓練學生朗讀時與老師眼神對接，克服害羞膽怯。</w:t>
+              <w:t>【假日自主自學與朗讀增量 C...</w:t>
             </w:r>
           </w:p>
         </w:tc>
         <w:tc>
           <w:tcPr>
-            <w:tcW w:type="dxa" w:w="2448"/>
+            <w:tcW w:type="dxa" w:w="3168"/>
             <w:vAlign w:val="center"/>
             <w:tcMar>
               <w:top w:w="50" w:type="dxa"/>
@@ -3203,7 +4172,35 @@
                 <w:color w:val="1E293B"/>
                 <w:sz w:val="17"/>
               </w:rPr>
-              <w:t>抬頭自然，眼神有光，與評審有穩定且真誠的視線交流，不慌張、不忘詞。</w:t>
+              <w:t>【週末自學指引】週末高強度增量：1. 完整全篇計時朗讀 12 遍；2. 舉辦「家庭朗讀觀摩會」，邀請爸爸、媽媽、阿公、阿嬤擔任評審打分；3. 錄製全篇影片。</w:t>
+            </w:r>
+          </w:p>
+        </w:tc>
+        <w:tc>
+          <w:tcPr>
+            <w:tcW w:type="dxa" w:w="2160"/>
+            <w:vAlign w:val="center"/>
+            <w:tcMar>
+              <w:top w:w="50" w:type="dxa"/>
+              <w:bottom w:w="50" w:type="dxa"/>
+              <w:left w:w="50" w:type="dxa"/>
+              <w:right w:w="50" w:type="dxa"/>
+            </w:tcMar>
+          </w:tcPr>
+          <w:p>
+            <w:pPr>
+              <w:spacing w:before="0" w:after="0"/>
+              <w:jc w:val="left"/>
+            </w:pPr>
+            <w:r>
+              <w:rPr>
+                <w:rFonts w:ascii="微軟正黑體" w:hAnsi="微軟正黑體" w:eastAsia="微軟正黑體"/>
+                <w:b w:val="0"/>
+                <w:i w:val="0"/>
+                <w:color w:val="1E293B"/>
+                <w:sz w:val="17"/>
+              </w:rPr>
+              <w:t>【特優】全篇流暢無比，聲情動人，如講故事般生動；【優等】流暢但缺乏起伏；【尚可】仍有些許字音猶豫。</w:t>
             </w:r>
           </w:p>
         </w:tc>
@@ -3234,8 +4231,6 @@
               <w:t>［ ］優</w:t>
               <w:br/>
               <w:t>［ ］良</w:t>
-              <w:br/>
-              <w:t>［ ］可</w:t>
             </w:r>
           </w:p>
         </w:tc>
@@ -3243,7 +4238,7 @@
       <w:tr>
         <w:tc>
           <w:tcPr>
-            <w:tcW w:type="dxa" w:w="936"/>
+            <w:tcW w:type="dxa" w:w="1152"/>
             <w:vAlign w:val="center"/>
             <w:tcMar>
               <w:top w:w="50" w:type="dxa"/>
@@ -3266,7 +4261,7 @@
                 <w:color w:val="1E293B"/>
                 <w:sz w:val="17"/>
               </w:rPr>
-              <w:t>Day 17</w:t>
+              <w:t>Day 16</w:t>
             </w:r>
           </w:p>
         </w:tc>
@@ -3295,13 +4290,13 @@
                 <w:color w:val="1E293B"/>
                 <w:sz w:val="17"/>
               </w:rPr>
-              <w:t>10/27 (二)</w:t>
+              <w:t>10/26 (一)</w:t>
             </w:r>
           </w:p>
         </w:tc>
         <w:tc>
           <w:tcPr>
-            <w:tcW w:type="dxa" w:w="1728"/>
+            <w:tcW w:type="dxa" w:w="936"/>
             <w:vAlign w:val="center"/>
             <w:tcMar>
               <w:top w:w="50" w:type="dxa"/>
@@ -3324,13 +4319,13 @@
                 <w:color w:val="1E293B"/>
                 <w:sz w:val="17"/>
               </w:rPr>
-              <w:t>3 分鐘鈴響心理建設與配速調控</w:t>
+              <w:t>在校集訓</w:t>
             </w:r>
           </w:p>
         </w:tc>
         <w:tc>
           <w:tcPr>
-            <w:tcW w:type="dxa" w:w="3456"/>
+            <w:tcW w:type="dxa" w:w="1872"/>
             <w:vAlign w:val="center"/>
             <w:tcMar>
               <w:top w:w="50" w:type="dxa"/>
@@ -3353,15 +4348,13 @@
                 <w:color w:val="1E293B"/>
                 <w:sz w:val="17"/>
               </w:rPr>
-              <w:t>【早修】鈴聲應對專題：競賽規定「朗讀 3 分鐘按鈴一次，4 分鐘按鈴兩次下台」。示範當聽到 3 分鐘鈴響時，學生剛好進入第三段後半部，絕不驚慌，保持原速沉著收尾。</w:t>
-              <w:br/>
-              <w:t>【午休】現場按鈴干擾測試，訓練學生「鈴聲響起心不慌、節奏依舊穩如山」的定力。</w:t>
+              <w:t>上台與下台禮儀：站姿、走步、...</w:t>
             </w:r>
           </w:p>
         </w:tc>
         <w:tc>
           <w:tcPr>
-            <w:tcW w:type="dxa" w:w="2448"/>
+            <w:tcW w:type="dxa" w:w="3168"/>
             <w:vAlign w:val="center"/>
             <w:tcMar>
               <w:top w:w="50" w:type="dxa"/>
@@ -3384,7 +4377,36 @@
                 <w:color w:val="1E293B"/>
                 <w:sz w:val="17"/>
               </w:rPr>
-              <w:t>聽聞鈴聲神色自若，完全不受影響，在 3分30秒左右從容完成全篇朗讀。</w:t>
+              <w:t>競賽台規與禮儀細節：步伐從容走上台、站穩於講台正中央、向評審鞠躬 30 度問好、自信報號與題目「各位評判老師好，我是四年丙班選手，今天我所要朗讀的題目是——藍蝴蝶」、朗讀完畢從容致謝「我的朗讀到此結束，謝謝各位評判老師」。</w:t>
+            </w:r>
+          </w:p>
+        </w:tc>
+        <w:tc>
+          <w:tcPr>
+            <w:tcW w:type="dxa" w:w="2160"/>
+            <w:vAlign w:val="center"/>
+            <w:tcMar>
+              <w:top w:w="50" w:type="dxa"/>
+              <w:bottom w:w="50" w:type="dxa"/>
+              <w:left w:w="50" w:type="dxa"/>
+              <w:right w:w="50" w:type="dxa"/>
+            </w:tcMar>
+            <w:shd w:fill="F8FAFC"/>
+          </w:tcPr>
+          <w:p>
+            <w:pPr>
+              <w:spacing w:before="0" w:after="0"/>
+              <w:jc w:val="left"/>
+            </w:pPr>
+            <w:r>
+              <w:rPr>
+                <w:rFonts w:ascii="微軟正黑體" w:hAnsi="微軟正黑體" w:eastAsia="微軟正黑體"/>
+                <w:b w:val="0"/>
+                <w:i w:val="0"/>
+                <w:color w:val="1E293B"/>
+                <w:sz w:val="17"/>
+              </w:rPr>
+              <w:t>儀態落落大方，步態穩健，鞠躬報題聲音洪亮，禮貌周全。</w:t>
             </w:r>
           </w:p>
         </w:tc>
@@ -3416,8 +4438,6 @@
               <w:t>［ ］優</w:t>
               <w:br/>
               <w:t>［ ］良</w:t>
-              <w:br/>
-              <w:t>［ ］可</w:t>
             </w:r>
           </w:p>
         </w:tc>
@@ -3425,7 +4445,7 @@
       <w:tr>
         <w:tc>
           <w:tcPr>
-            <w:tcW w:type="dxa" w:w="936"/>
+            <w:tcW w:type="dxa" w:w="1152"/>
             <w:vAlign w:val="center"/>
             <w:tcMar>
               <w:top w:w="50" w:type="dxa"/>
@@ -3447,7 +4467,7 @@
                 <w:color w:val="1E293B"/>
                 <w:sz w:val="17"/>
               </w:rPr>
-              <w:t>Day 18</w:t>
+              <w:t>Day 17</w:t>
             </w:r>
           </w:p>
         </w:tc>
@@ -3475,13 +4495,13 @@
                 <w:color w:val="1E293B"/>
                 <w:sz w:val="17"/>
               </w:rPr>
-              <w:t>10/28 (三)</w:t>
+              <w:t>10/27 (二)</w:t>
             </w:r>
           </w:p>
         </w:tc>
         <w:tc>
           <w:tcPr>
-            <w:tcW w:type="dxa" w:w="1728"/>
+            <w:tcW w:type="dxa" w:w="936"/>
             <w:vAlign w:val="center"/>
             <w:tcMar>
               <w:top w:w="50" w:type="dxa"/>
@@ -3503,13 +4523,13 @@
                 <w:color w:val="1E293B"/>
                 <w:sz w:val="17"/>
               </w:rPr>
-              <w:t>抗噪訓練與極限環境適應</w:t>
+              <w:t>在校集訓</w:t>
             </w:r>
           </w:p>
         </w:tc>
         <w:tc>
           <w:tcPr>
-            <w:tcW w:type="dxa" w:w="3456"/>
+            <w:tcW w:type="dxa" w:w="1872"/>
             <w:vAlign w:val="center"/>
             <w:tcMar>
               <w:top w:w="50" w:type="dxa"/>
@@ -3531,15 +4551,13 @@
                 <w:color w:val="1E293B"/>
                 <w:sz w:val="17"/>
               </w:rPr>
-              <w:t>【早修】抗干擾特訓：在全班有走動或背景噪音的環境下朗讀，訓練專注度；調整嗓音投影（音量放大 20%），讓聲音穿透整個考場。</w:t>
-              <w:br/>
-              <w:t>【午休】帶學生至視聽教室或較大空間試音，體會空間迴音與麥克風距離控制。</w:t>
+              <w:t>抗壓與干擾訓練：噪音適應與突...</w:t>
             </w:r>
           </w:p>
         </w:tc>
         <w:tc>
           <w:tcPr>
-            <w:tcW w:type="dxa" w:w="2448"/>
+            <w:tcW w:type="dxa" w:w="3168"/>
             <w:vAlign w:val="center"/>
             <w:tcMar>
               <w:top w:w="50" w:type="dxa"/>
@@ -3561,7 +4579,35 @@
                 <w:color w:val="1E293B"/>
                 <w:sz w:val="17"/>
               </w:rPr>
-              <w:t>音量宏亮飽滿，聲音穿透力強，在任何環境干擾下皆能專心致志。</w:t>
+              <w:t>抗壓訓練：在朗讀過程中模擬突發狀況（如窗外噪音、評審翻閱資料聲、鈴聲干擾），訓練專注力與定力。不因外界干擾而分心或斷詞。</w:t>
+            </w:r>
+          </w:p>
+        </w:tc>
+        <w:tc>
+          <w:tcPr>
+            <w:tcW w:type="dxa" w:w="2160"/>
+            <w:vAlign w:val="center"/>
+            <w:tcMar>
+              <w:top w:w="50" w:type="dxa"/>
+              <w:bottom w:w="50" w:type="dxa"/>
+              <w:left w:w="50" w:type="dxa"/>
+              <w:right w:w="50" w:type="dxa"/>
+            </w:tcMar>
+          </w:tcPr>
+          <w:p>
+            <w:pPr>
+              <w:spacing w:before="0" w:after="0"/>
+              <w:jc w:val="left"/>
+            </w:pPr>
+            <w:r>
+              <w:rPr>
+                <w:rFonts w:ascii="微軟正黑體" w:hAnsi="微軟正黑體" w:eastAsia="微軟正黑體"/>
+                <w:b w:val="0"/>
+                <w:i w:val="0"/>
+                <w:color w:val="1E293B"/>
+                <w:sz w:val="17"/>
+              </w:rPr>
+              <w:t>抗干擾能力強，專注度百分之百，節奏沉穩不慌亂。</w:t>
             </w:r>
           </w:p>
         </w:tc>
@@ -3592,8 +4638,6 @@
               <w:t>［ ］優</w:t>
               <w:br/>
               <w:t>［ ］良</w:t>
-              <w:br/>
-              <w:t>［ ］可</w:t>
             </w:r>
           </w:p>
         </w:tc>
@@ -3601,7 +4645,7 @@
       <w:tr>
         <w:tc>
           <w:tcPr>
-            <w:tcW w:type="dxa" w:w="936"/>
+            <w:tcW w:type="dxa" w:w="1152"/>
             <w:vAlign w:val="center"/>
             <w:tcMar>
               <w:top w:w="50" w:type="dxa"/>
@@ -3624,7 +4668,7 @@
                 <w:color w:val="1E293B"/>
                 <w:sz w:val="17"/>
               </w:rPr>
-              <w:t>Day 19</w:t>
+              <w:t>Day 18</w:t>
             </w:r>
           </w:p>
         </w:tc>
@@ -3653,13 +4697,13 @@
                 <w:color w:val="1E293B"/>
                 <w:sz w:val="17"/>
               </w:rPr>
-              <w:t>10/29 (四)</w:t>
+              <w:t>10/28 (三)</w:t>
             </w:r>
           </w:p>
         </w:tc>
         <w:tc>
           <w:tcPr>
-            <w:tcW w:type="dxa" w:w="1728"/>
+            <w:tcW w:type="dxa" w:w="936"/>
             <w:vAlign w:val="center"/>
             <w:tcMar>
               <w:top w:w="50" w:type="dxa"/>
@@ -3682,13 +4726,13 @@
                 <w:color w:val="1E293B"/>
                 <w:sz w:val="17"/>
               </w:rPr>
-              <w:t>全套上下台禮儀流程彩排</w:t>
+              <w:t>在校集訓</w:t>
             </w:r>
           </w:p>
         </w:tc>
         <w:tc>
           <w:tcPr>
-            <w:tcW w:type="dxa" w:w="3456"/>
+            <w:tcW w:type="dxa" w:w="1872"/>
             <w:vAlign w:val="center"/>
             <w:tcMar>
               <w:top w:w="50" w:type="dxa"/>
@@ -3711,15 +4755,13 @@
                 <w:color w:val="1E293B"/>
                 <w:sz w:val="17"/>
               </w:rPr>
-              <w:t>【早修】上台完整 SOP 彩排：1. 聽到號次，從容步上講台；2. 向評判鞠躬 45 度微笑致意；3. 雙手捧稿於胸前；4. 報題目：「四年丙班選手好，今天我所要朗讀的題目是——藍蝴蝶，作者：林清玄。」；5. 朗讀全篇；6. 朗讀完畢，向評審鞠躬：「謝謝各位評判老師」，優雅下台。</w:t>
-              <w:br/>
-              <w:t>【午休】逐項打磨上下台步態、鞠躬角度與微笑表情，消除緊張僵硬動作。</w:t>
+              <w:t>2 分鐘鈴聲掌控特訓：從容完...</w:t>
             </w:r>
           </w:p>
         </w:tc>
         <w:tc>
           <w:tcPr>
-            <w:tcW w:type="dxa" w:w="2448"/>
+            <w:tcW w:type="dxa" w:w="3168"/>
             <w:vAlign w:val="center"/>
             <w:tcMar>
               <w:top w:w="50" w:type="dxa"/>
@@ -3742,7 +4784,36 @@
                 <w:color w:val="1E293B"/>
                 <w:sz w:val="17"/>
               </w:rPr>
-              <w:t>上下台落落大方，儀態優雅端莊，展現四年丙班選手出眾氣質。</w:t>
+              <w:t>比賽時間掌控：按簡章規定，限時 2 分鐘（一響鈴即立即下台）。學生全篇朗讀須在 1分45秒 至 1分50秒 內自然讀完，聞鈴前即已完美收尾致謝！</w:t>
+            </w:r>
+          </w:p>
+        </w:tc>
+        <w:tc>
+          <w:tcPr>
+            <w:tcW w:type="dxa" w:w="2160"/>
+            <w:vAlign w:val="center"/>
+            <w:tcMar>
+              <w:top w:w="50" w:type="dxa"/>
+              <w:bottom w:w="50" w:type="dxa"/>
+              <w:left w:w="50" w:type="dxa"/>
+              <w:right w:w="50" w:type="dxa"/>
+            </w:tcMar>
+            <w:shd w:fill="F8FAFC"/>
+          </w:tcPr>
+          <w:p>
+            <w:pPr>
+              <w:spacing w:before="0" w:after="0"/>
+              <w:jc w:val="left"/>
+            </w:pPr>
+            <w:r>
+              <w:rPr>
+                <w:rFonts w:ascii="微軟正黑體" w:hAnsi="微軟正黑體" w:eastAsia="微軟正黑體"/>
+                <w:b w:val="0"/>
+                <w:i w:val="0"/>
+                <w:color w:val="1E293B"/>
+                <w:sz w:val="17"/>
+              </w:rPr>
+              <w:t>時間控制完美（1分45秒~1分52秒），從容完篇，給評審極佳的專業印象。</w:t>
             </w:r>
           </w:p>
         </w:tc>
@@ -3774,8 +4845,6 @@
               <w:t>［ ］優</w:t>
               <w:br/>
               <w:t>［ ］良</w:t>
-              <w:br/>
-              <w:t>［ ］可</w:t>
             </w:r>
           </w:p>
         </w:tc>
@@ -3783,7 +4852,7 @@
       <w:tr>
         <w:tc>
           <w:tcPr>
-            <w:tcW w:type="dxa" w:w="936"/>
+            <w:tcW w:type="dxa" w:w="1152"/>
             <w:vAlign w:val="center"/>
             <w:tcMar>
               <w:top w:w="50" w:type="dxa"/>
@@ -3805,7 +4874,7 @@
                 <w:color w:val="1E293B"/>
                 <w:sz w:val="17"/>
               </w:rPr>
-              <w:t>Day 20</w:t>
+              <w:t>Day 19</w:t>
             </w:r>
           </w:p>
         </w:tc>
@@ -3833,13 +4902,13 @@
                 <w:color w:val="1E293B"/>
                 <w:sz w:val="17"/>
               </w:rPr>
-              <w:t>10/30 (五)</w:t>
+              <w:t>10/29 (四)</w:t>
             </w:r>
           </w:p>
         </w:tc>
         <w:tc>
           <w:tcPr>
-            <w:tcW w:type="dxa" w:w="1728"/>
+            <w:tcW w:type="dxa" w:w="936"/>
             <w:vAlign w:val="center"/>
             <w:tcMar>
               <w:top w:w="50" w:type="dxa"/>
@@ -3861,13 +4930,13 @@
                 <w:color w:val="1E293B"/>
                 <w:sz w:val="17"/>
               </w:rPr>
-              <w:t>賽前全真模擬考與導師終極提點</w:t>
+              <w:t>在校集訓</w:t>
             </w:r>
           </w:p>
         </w:tc>
         <w:tc>
           <w:tcPr>
-            <w:tcW w:type="dxa" w:w="3456"/>
+            <w:tcW w:type="dxa" w:w="1872"/>
             <w:vAlign w:val="center"/>
             <w:tcMar>
               <w:top w:w="50" w:type="dxa"/>
@@ -3889,15 +4958,13 @@
                 <w:color w:val="1E293B"/>
                 <w:sz w:val="17"/>
               </w:rPr>
-              <w:t>【早修】全真模擬考：限時 4 分鐘（正式計時），完全比照競賽規格，登台朗讀林清玄〈藍蝴蝶〉。導師全面針對語音50%、聲情40%、儀態10%給予終極講評與信心賦能！</w:t>
-              <w:br/>
-              <w:t>【午休】最後叮嚀賽前嗓音保養（多喝溫開水、忌吃炸辣、保證充足睡眠），贈送幸運筆記卡，整裝出發！</w:t>
+              <w:t>全真賽前模擬演練（活動中心簡...</w:t>
             </w:r>
           </w:p>
         </w:tc>
         <w:tc>
           <w:tcPr>
-            <w:tcW w:type="dxa" w:w="2448"/>
+            <w:tcW w:type="dxa" w:w="3168"/>
             <w:vAlign w:val="center"/>
             <w:tcMar>
               <w:top w:w="50" w:type="dxa"/>
@@ -3919,7 +4986,35 @@
                 <w:color w:val="1E293B"/>
                 <w:sz w:val="17"/>
               </w:rPr>
-              <w:t>全篇朗讀近乎完美，聲情並茂，儀態大方，自信滿滿，具備衝擊校內特優實力！</w:t>
+              <w:t>實地走位模擬：前往活動中心簡報室（比賽場地）進行全真走位與發聲練習。感受比賽場地的回音、光線與講台高度，消除陌生感。</w:t>
+            </w:r>
+          </w:p>
+        </w:tc>
+        <w:tc>
+          <w:tcPr>
+            <w:tcW w:type="dxa" w:w="2160"/>
+            <w:vAlign w:val="center"/>
+            <w:tcMar>
+              <w:top w:w="50" w:type="dxa"/>
+              <w:bottom w:w="50" w:type="dxa"/>
+              <w:left w:w="50" w:type="dxa"/>
+              <w:right w:w="50" w:type="dxa"/>
+            </w:tcMar>
+          </w:tcPr>
+          <w:p>
+            <w:pPr>
+              <w:spacing w:before="0" w:after="0"/>
+              <w:jc w:val="left"/>
+            </w:pPr>
+            <w:r>
+              <w:rPr>
+                <w:rFonts w:ascii="微軟正黑體" w:hAnsi="微軟正黑體" w:eastAsia="微軟正黑體"/>
+                <w:b w:val="0"/>
+                <w:i w:val="0"/>
+                <w:color w:val="1E293B"/>
+                <w:sz w:val="17"/>
+              </w:rPr>
+              <w:t>適應比賽場地，聲音能清晰傳達到最後一排，颱風沈著穩健。</w:t>
             </w:r>
           </w:p>
         </w:tc>
@@ -3950,8 +5045,413 @@
               <w:t>［ ］優</w:t>
               <w:br/>
               <w:t>［ ］良</w:t>
+            </w:r>
+          </w:p>
+        </w:tc>
+      </w:tr>
+      <w:tr>
+        <w:tc>
+          <w:tcPr>
+            <w:tcW w:type="dxa" w:w="1152"/>
+            <w:vAlign w:val="center"/>
+            <w:tcMar>
+              <w:top w:w="50" w:type="dxa"/>
+              <w:bottom w:w="50" w:type="dxa"/>
+              <w:left w:w="50" w:type="dxa"/>
+              <w:right w:w="50" w:type="dxa"/>
+            </w:tcMar>
+            <w:shd w:fill="F8FAFC"/>
+          </w:tcPr>
+          <w:p>
+            <w:pPr>
+              <w:spacing w:before="0" w:after="0"/>
+              <w:jc w:val="center"/>
+            </w:pPr>
+            <w:r>
+              <w:rPr>
+                <w:rFonts w:ascii="微軟正黑體" w:hAnsi="微軟正黑體" w:eastAsia="微軟正黑體"/>
+                <w:b/>
+                <w:i w:val="0"/>
+                <w:color w:val="1E293B"/>
+                <w:sz w:val="17"/>
+              </w:rPr>
+              <w:t>Day 20</w:t>
+            </w:r>
+          </w:p>
+        </w:tc>
+        <w:tc>
+          <w:tcPr>
+            <w:tcW w:type="dxa" w:w="1224"/>
+            <w:vAlign w:val="center"/>
+            <w:tcMar>
+              <w:top w:w="50" w:type="dxa"/>
+              <w:bottom w:w="50" w:type="dxa"/>
+              <w:left w:w="50" w:type="dxa"/>
+              <w:right w:w="50" w:type="dxa"/>
+            </w:tcMar>
+            <w:shd w:fill="F8FAFC"/>
+          </w:tcPr>
+          <w:p>
+            <w:pPr>
+              <w:spacing w:before="0" w:after="0"/>
+              <w:jc w:val="left"/>
+            </w:pPr>
+            <w:r>
+              <w:rPr>
+                <w:rFonts w:ascii="微軟正黑體" w:hAnsi="微軟正黑體" w:eastAsia="微軟正黑體"/>
+                <w:b w:val="0"/>
+                <w:i w:val="0"/>
+                <w:color w:val="1E293B"/>
+                <w:sz w:val="17"/>
+              </w:rPr>
+              <w:t>10/30 (五)</w:t>
+            </w:r>
+          </w:p>
+        </w:tc>
+        <w:tc>
+          <w:tcPr>
+            <w:tcW w:type="dxa" w:w="936"/>
+            <w:vAlign w:val="center"/>
+            <w:tcMar>
+              <w:top w:w="50" w:type="dxa"/>
+              <w:bottom w:w="50" w:type="dxa"/>
+              <w:left w:w="50" w:type="dxa"/>
+              <w:right w:w="50" w:type="dxa"/>
+            </w:tcMar>
+            <w:shd w:fill="F8FAFC"/>
+          </w:tcPr>
+          <w:p>
+            <w:pPr>
+              <w:spacing w:before="0" w:after="0"/>
+              <w:jc w:val="left"/>
+            </w:pPr>
+            <w:r>
+              <w:rPr>
+                <w:rFonts w:ascii="微軟正黑體" w:hAnsi="微軟正黑體" w:eastAsia="微軟正黑體"/>
+                <w:b w:val="0"/>
+                <w:i w:val="0"/>
+                <w:color w:val="1E293B"/>
+                <w:sz w:val="17"/>
+              </w:rPr>
+              <w:t>在校集訓</w:t>
+            </w:r>
+          </w:p>
+        </w:tc>
+        <w:tc>
+          <w:tcPr>
+            <w:tcW w:type="dxa" w:w="1872"/>
+            <w:vAlign w:val="center"/>
+            <w:tcMar>
+              <w:top w:w="50" w:type="dxa"/>
+              <w:bottom w:w="50" w:type="dxa"/>
+              <w:left w:w="50" w:type="dxa"/>
+              <w:right w:w="50" w:type="dxa"/>
+            </w:tcMar>
+            <w:shd w:fill="F8FAFC"/>
+          </w:tcPr>
+          <w:p>
+            <w:pPr>
+              <w:spacing w:before="0" w:after="0"/>
+              <w:jc w:val="left"/>
+            </w:pPr>
+            <w:r>
+              <w:rPr>
+                <w:rFonts w:ascii="微軟正黑體" w:hAnsi="微軟正黑體" w:eastAsia="微軟正黑體"/>
+                <w:b w:val="0"/>
+                <w:i w:val="0"/>
+                <w:color w:val="1E293B"/>
+                <w:sz w:val="17"/>
+              </w:rPr>
+              <w:t>終極驗收、信心建立與出征授旗...</w:t>
+            </w:r>
+          </w:p>
+        </w:tc>
+        <w:tc>
+          <w:tcPr>
+            <w:tcW w:type="dxa" w:w="3168"/>
+            <w:vAlign w:val="center"/>
+            <w:tcMar>
+              <w:top w:w="50" w:type="dxa"/>
+              <w:bottom w:w="50" w:type="dxa"/>
+              <w:left w:w="50" w:type="dxa"/>
+              <w:right w:w="50" w:type="dxa"/>
+            </w:tcMar>
+            <w:shd w:fill="F8FAFC"/>
+          </w:tcPr>
+          <w:p>
+            <w:pPr>
+              <w:spacing w:before="0" w:after="0"/>
+              <w:jc w:val="left"/>
+            </w:pPr>
+            <w:r>
+              <w:rPr>
+                <w:rFonts w:ascii="微軟正黑體" w:hAnsi="微軟正黑體" w:eastAsia="微軟正黑體"/>
+                <w:b w:val="0"/>
+                <w:i w:val="0"/>
+                <w:color w:val="1E293B"/>
+                <w:sz w:val="17"/>
+              </w:rPr>
+              <w:t>終極出征檢閱：四年丙班全班同學為選手加油打氣。進行最後一次完美朗讀。導師頒發「出征授旗榮譽卡」，給予百分之百信心賦能！</w:t>
+            </w:r>
+          </w:p>
+        </w:tc>
+        <w:tc>
+          <w:tcPr>
+            <w:tcW w:type="dxa" w:w="2160"/>
+            <w:vAlign w:val="center"/>
+            <w:tcMar>
+              <w:top w:w="50" w:type="dxa"/>
+              <w:bottom w:w="50" w:type="dxa"/>
+              <w:left w:w="50" w:type="dxa"/>
+              <w:right w:w="50" w:type="dxa"/>
+            </w:tcMar>
+            <w:shd w:fill="F8FAFC"/>
+          </w:tcPr>
+          <w:p>
+            <w:pPr>
+              <w:spacing w:before="0" w:after="0"/>
+              <w:jc w:val="left"/>
+            </w:pPr>
+            <w:r>
+              <w:rPr>
+                <w:rFonts w:ascii="微軟正黑體" w:hAnsi="微軟正黑體" w:eastAsia="微軟正黑體"/>
+                <w:b w:val="0"/>
+                <w:i w:val="0"/>
+                <w:color w:val="1E293B"/>
+                <w:sz w:val="17"/>
+              </w:rPr>
+              <w:t>心態自信陽光，技藝純熟圓融，具備奪冠實力與大家風範。</w:t>
+            </w:r>
+          </w:p>
+        </w:tc>
+        <w:tc>
+          <w:tcPr>
+            <w:tcW w:type="dxa" w:w="1008"/>
+            <w:vAlign w:val="center"/>
+            <w:tcMar>
+              <w:top w:w="50" w:type="dxa"/>
+              <w:bottom w:w="50" w:type="dxa"/>
+              <w:left w:w="50" w:type="dxa"/>
+              <w:right w:w="50" w:type="dxa"/>
+            </w:tcMar>
+            <w:shd w:fill="F8FAFC"/>
+          </w:tcPr>
+          <w:p>
+            <w:pPr>
+              <w:spacing w:before="0" w:after="0"/>
+              <w:jc w:val="left"/>
+            </w:pPr>
+            <w:r>
+              <w:rPr>
+                <w:rFonts w:ascii="微軟正黑體" w:hAnsi="微軟正黑體" w:eastAsia="微軟正黑體"/>
+                <w:b w:val="0"/>
+                <w:i w:val="0"/>
+                <w:color w:val="1E293B"/>
+                <w:sz w:val="17"/>
+              </w:rPr>
+              <w:t>［ ］優</w:t>
               <w:br/>
-              <w:t>［ ］可</w:t>
+              <w:t>［ ］良</w:t>
+            </w:r>
+          </w:p>
+        </w:tc>
+      </w:tr>
+      <w:tr>
+        <w:tc>
+          <w:tcPr>
+            <w:tcW w:type="dxa" w:w="1152"/>
+            <w:vAlign w:val="center"/>
+            <w:tcMar>
+              <w:top w:w="50" w:type="dxa"/>
+              <w:bottom w:w="50" w:type="dxa"/>
+              <w:left w:w="50" w:type="dxa"/>
+              <w:right w:w="50" w:type="dxa"/>
+            </w:tcMar>
+          </w:tcPr>
+          <w:p>
+            <w:pPr>
+              <w:spacing w:before="0" w:after="0"/>
+              <w:jc w:val="center"/>
+            </w:pPr>
+            <w:r>
+              <w:rPr>
+                <w:rFonts w:ascii="微軟正黑體" w:hAnsi="微軟正黑體" w:eastAsia="微軟正黑體"/>
+                <w:b/>
+                <w:i w:val="0"/>
+                <w:color w:val="1E293B"/>
+                <w:sz w:val="17"/>
+              </w:rPr>
+              <w:t>週末假日四</w:t>
+            </w:r>
+          </w:p>
+        </w:tc>
+        <w:tc>
+          <w:tcPr>
+            <w:tcW w:type="dxa" w:w="1224"/>
+            <w:vAlign w:val="center"/>
+            <w:tcMar>
+              <w:top w:w="50" w:type="dxa"/>
+              <w:bottom w:w="50" w:type="dxa"/>
+              <w:left w:w="50" w:type="dxa"/>
+              <w:right w:w="50" w:type="dxa"/>
+            </w:tcMar>
+          </w:tcPr>
+          <w:p>
+            <w:pPr>
+              <w:spacing w:before="0" w:after="0"/>
+              <w:jc w:val="left"/>
+            </w:pPr>
+            <w:r>
+              <w:rPr>
+                <w:rFonts w:ascii="微軟正黑體" w:hAnsi="微軟正黑體" w:eastAsia="微軟正黑體"/>
+                <w:b w:val="0"/>
+                <w:i w:val="0"/>
+                <w:color w:val="1E293B"/>
+                <w:sz w:val="17"/>
+              </w:rPr>
+              <w:t>10/31 (六) ~ 11/01 (日)</w:t>
+            </w:r>
+          </w:p>
+        </w:tc>
+        <w:tc>
+          <w:tcPr>
+            <w:tcW w:type="dxa" w:w="936"/>
+            <w:vAlign w:val="center"/>
+            <w:tcMar>
+              <w:top w:w="50" w:type="dxa"/>
+              <w:bottom w:w="50" w:type="dxa"/>
+              <w:left w:w="50" w:type="dxa"/>
+              <w:right w:w="50" w:type="dxa"/>
+            </w:tcMar>
+          </w:tcPr>
+          <w:p>
+            <w:pPr>
+              <w:spacing w:before="0" w:after="0"/>
+              <w:jc w:val="left"/>
+            </w:pPr>
+            <w:r>
+              <w:rPr>
+                <w:rFonts w:ascii="微軟正黑體" w:hAnsi="微軟正黑體" w:eastAsia="微軟正黑體"/>
+                <w:b w:val="0"/>
+                <w:i w:val="0"/>
+                <w:color w:val="1E293B"/>
+                <w:sz w:val="17"/>
+              </w:rPr>
+              <w:t>假日自學增量</w:t>
+            </w:r>
+          </w:p>
+        </w:tc>
+        <w:tc>
+          <w:tcPr>
+            <w:tcW w:type="dxa" w:w="1872"/>
+            <w:vAlign w:val="center"/>
+            <w:tcMar>
+              <w:top w:w="50" w:type="dxa"/>
+              <w:bottom w:w="50" w:type="dxa"/>
+              <w:left w:w="50" w:type="dxa"/>
+              <w:right w:w="50" w:type="dxa"/>
+            </w:tcMar>
+          </w:tcPr>
+          <w:p>
+            <w:pPr>
+              <w:spacing w:before="0" w:after="0"/>
+              <w:jc w:val="left"/>
+            </w:pPr>
+            <w:r>
+              <w:rPr>
+                <w:rFonts w:ascii="微軟正黑體" w:hAnsi="微軟正黑體" w:eastAsia="微軟正黑體"/>
+                <w:b w:val="0"/>
+                <w:i w:val="0"/>
+                <w:color w:val="1E293B"/>
+                <w:sz w:val="17"/>
+              </w:rPr>
+              <w:t>【假日自主自學與朗讀增量 D...</w:t>
+            </w:r>
+          </w:p>
+        </w:tc>
+        <w:tc>
+          <w:tcPr>
+            <w:tcW w:type="dxa" w:w="3168"/>
+            <w:vAlign w:val="center"/>
+            <w:tcMar>
+              <w:top w:w="50" w:type="dxa"/>
+              <w:bottom w:w="50" w:type="dxa"/>
+              <w:left w:w="50" w:type="dxa"/>
+              <w:right w:w="50" w:type="dxa"/>
+            </w:tcMar>
+          </w:tcPr>
+          <w:p>
+            <w:pPr>
+              <w:spacing w:before="0" w:after="0"/>
+              <w:jc w:val="left"/>
+            </w:pPr>
+            <w:r>
+              <w:rPr>
+                <w:rFonts w:ascii="微軟正黑體" w:hAnsi="微軟正黑體" w:eastAsia="微軟正黑體"/>
+                <w:b w:val="0"/>
+                <w:i w:val="0"/>
+                <w:color w:val="1E293B"/>
+                <w:sz w:val="17"/>
+              </w:rPr>
+              <w:t>【週末自學指引】賽前最後週末：不宜過度過量耗費嗓子，轉為「潤讀與意念冥想」：全篇輕聲潤讀 5 遍，多喝溫水，充足睡眠。</w:t>
+            </w:r>
+          </w:p>
+        </w:tc>
+        <w:tc>
+          <w:tcPr>
+            <w:tcW w:type="dxa" w:w="2160"/>
+            <w:vAlign w:val="center"/>
+            <w:tcMar>
+              <w:top w:w="50" w:type="dxa"/>
+              <w:bottom w:w="50" w:type="dxa"/>
+              <w:left w:w="50" w:type="dxa"/>
+              <w:right w:w="50" w:type="dxa"/>
+            </w:tcMar>
+          </w:tcPr>
+          <w:p>
+            <w:pPr>
+              <w:spacing w:before="0" w:after="0"/>
+              <w:jc w:val="left"/>
+            </w:pPr>
+            <w:r>
+              <w:rPr>
+                <w:rFonts w:ascii="微軟正黑體" w:hAnsi="微軟正黑體" w:eastAsia="微軟正黑體"/>
+                <w:b w:val="0"/>
+                <w:i w:val="0"/>
+                <w:color w:val="1E293B"/>
+                <w:sz w:val="17"/>
+              </w:rPr>
+              <w:t>【特優】精神飽滿、嗓音明亮純淨、自信從容。</w:t>
+            </w:r>
+          </w:p>
+        </w:tc>
+        <w:tc>
+          <w:tcPr>
+            <w:tcW w:type="dxa" w:w="1008"/>
+            <w:vAlign w:val="center"/>
+            <w:tcMar>
+              <w:top w:w="50" w:type="dxa"/>
+              <w:bottom w:w="50" w:type="dxa"/>
+              <w:left w:w="50" w:type="dxa"/>
+              <w:right w:w="50" w:type="dxa"/>
+            </w:tcMar>
+          </w:tcPr>
+          <w:p>
+            <w:pPr>
+              <w:spacing w:before="0" w:after="0"/>
+              <w:jc w:val="left"/>
+            </w:pPr>
+            <w:r>
+              <w:rPr>
+                <w:rFonts w:ascii="微軟正黑體" w:hAnsi="微軟正黑體" w:eastAsia="微軟正黑體"/>
+                <w:b w:val="0"/>
+                <w:i w:val="0"/>
+                <w:color w:val="1E293B"/>
+                <w:sz w:val="17"/>
+              </w:rPr>
+              <w:t>［ ］優</w:t>
+              <w:br/>
+              <w:t>［ ］良</w:t>
             </w:r>
           </w:p>
         </w:tc>

</xml_diff>